<commit_message>
Docx mejorados base de datos
</commit_message>
<xml_diff>
--- a/Prácticas Bases de datos/PRÁCTICA 1 BASE DE DATOS.docx
+++ b/Prácticas Bases de datos/PRÁCTICA 1 BASE DE DATOS.docx
@@ -120,53 +120,172 @@
     <w:p>
       <w:pPr>
         <w:rPr>
-          <w:sz w:val="24"/>
-          <w:szCs w:val="24"/>
+          <w:i/>
+          <w:iCs/>
+          <w:sz w:val="36"/>
+          <w:szCs w:val="36"/>
           <w:u w:val="single"/>
         </w:rPr>
       </w:pPr>
       <w:r>
         <w:rPr>
-          <w:sz w:val="24"/>
-          <w:szCs w:val="24"/>
+          <w:i/>
+          <w:iCs/>
+          <w:sz w:val="36"/>
+          <w:szCs w:val="36"/>
           <w:u w:val="single"/>
         </w:rPr>
-        <w:t>Parte 1</w:t>
-      </w:r>
-    </w:p>
-    <w:p>
-      <w:pPr>
-        <w:pStyle w:val="ListParagraph"/>
-        <w:numPr>
-          <w:ilvl w:val="0"/>
-          <w:numId w:val="1"/>
-        </w:numPr>
-        <w:rPr>
-          <w:sz w:val="24"/>
-          <w:szCs w:val="24"/>
-        </w:rPr>
-      </w:pPr>
-      <w:r>
-        <w:rPr>
-          <w:sz w:val="24"/>
-          <w:szCs w:val="24"/>
-        </w:rPr>
-        <w:t>Ejercicio 1</w:t>
-      </w:r>
-    </w:p>
-    <w:p>
-      <w:pPr>
-        <w:rPr>
-          <w:sz w:val="24"/>
-          <w:szCs w:val="24"/>
-        </w:rPr>
-      </w:pPr>
-      <w:r>
-        <w:rPr>
-          <w:sz w:val="24"/>
-          <w:szCs w:val="24"/>
-        </w:rPr>
-        <w:t xml:space="preserve">Para importar las tablas de la base de datos Classic model he usado el comando source seguido de la dirección donde está el archivo en .sql </w:t>
+        <w:t xml:space="preserve">Parte </w:t>
+      </w:r>
+      <w:r>
+        <w:rPr>
+          <w:i/>
+          <w:iCs/>
+          <w:sz w:val="36"/>
+          <w:szCs w:val="36"/>
+          <w:u w:val="single"/>
+        </w:rPr>
+        <w:t>1</w:t>
+      </w:r>
+    </w:p>
+    <w:p>
+      <w:pPr>
+        <w:rPr>
+          <w:b/>
+          <w:bCs/>
+          <w:i/>
+          <w:iCs/>
+          <w:sz w:val="28"/>
+          <w:szCs w:val="28"/>
+        </w:rPr>
+      </w:pPr>
+      <w:r>
+        <w:rPr>
+          <w:b/>
+          <w:bCs/>
+          <w:i/>
+          <w:iCs/>
+          <w:sz w:val="28"/>
+          <w:szCs w:val="28"/>
+        </w:rPr>
+        <w:t xml:space="preserve">1.Si no lo has usado ya, escribe el comando para usar la base de datos </w:t>
+      </w:r>
+      <w:proofErr w:type="spellStart"/>
+      <w:r>
+        <w:rPr>
+          <w:b/>
+          <w:bCs/>
+          <w:i/>
+          <w:iCs/>
+          <w:sz w:val="28"/>
+          <w:szCs w:val="28"/>
+        </w:rPr>
+        <w:t>Classic</w:t>
+      </w:r>
+      <w:proofErr w:type="spellEnd"/>
+      <w:r>
+        <w:rPr>
+          <w:b/>
+          <w:bCs/>
+          <w:i/>
+          <w:iCs/>
+          <w:sz w:val="28"/>
+          <w:szCs w:val="28"/>
+        </w:rPr>
+        <w:t xml:space="preserve"> </w:t>
+      </w:r>
+      <w:proofErr w:type="spellStart"/>
+      <w:r>
+        <w:rPr>
+          <w:b/>
+          <w:bCs/>
+          <w:i/>
+          <w:iCs/>
+          <w:sz w:val="28"/>
+          <w:szCs w:val="28"/>
+        </w:rPr>
+        <w:t>models</w:t>
+      </w:r>
+      <w:proofErr w:type="spellEnd"/>
+      <w:r>
+        <w:rPr>
+          <w:b/>
+          <w:bCs/>
+          <w:i/>
+          <w:iCs/>
+          <w:sz w:val="28"/>
+          <w:szCs w:val="28"/>
+        </w:rPr>
+        <w:t xml:space="preserve"> </w:t>
+      </w:r>
+    </w:p>
+    <w:p>
+      <w:pPr>
+        <w:rPr>
+          <w:sz w:val="24"/>
+          <w:szCs w:val="24"/>
+        </w:rPr>
+      </w:pPr>
+      <w:r>
+        <w:rPr>
+          <w:sz w:val="24"/>
+          <w:szCs w:val="24"/>
+        </w:rPr>
+        <w:t xml:space="preserve">Para importar las tablas de la base de datos </w:t>
+      </w:r>
+      <w:proofErr w:type="spellStart"/>
+      <w:r>
+        <w:rPr>
+          <w:b/>
+          <w:bCs/>
+          <w:sz w:val="24"/>
+          <w:szCs w:val="24"/>
+        </w:rPr>
+        <w:t>Classic</w:t>
+      </w:r>
+      <w:proofErr w:type="spellEnd"/>
+      <w:r>
+        <w:rPr>
+          <w:b/>
+          <w:bCs/>
+          <w:sz w:val="24"/>
+          <w:szCs w:val="24"/>
+        </w:rPr>
+        <w:t xml:space="preserve"> </w:t>
+      </w:r>
+      <w:proofErr w:type="spellStart"/>
+      <w:r>
+        <w:rPr>
+          <w:b/>
+          <w:bCs/>
+          <w:sz w:val="24"/>
+          <w:szCs w:val="24"/>
+        </w:rPr>
+        <w:t>Models</w:t>
+      </w:r>
+      <w:proofErr w:type="spellEnd"/>
+      <w:r>
+        <w:rPr>
+          <w:sz w:val="24"/>
+          <w:szCs w:val="24"/>
+        </w:rPr>
+        <w:t>, he utilizado el comando SOURCE seguido de la ruta del archivo .</w:t>
+      </w:r>
+      <w:proofErr w:type="spellStart"/>
+      <w:r>
+        <w:rPr>
+          <w:sz w:val="24"/>
+          <w:szCs w:val="24"/>
+        </w:rPr>
+        <w:t>sql</w:t>
+      </w:r>
+      <w:proofErr w:type="spellEnd"/>
+      <w:r>
+        <w:rPr>
+          <w:sz w:val="24"/>
+          <w:szCs w:val="24"/>
+        </w:rPr>
+        <w:t xml:space="preserve"> que contiene las definiciones de las tablas.</w:t>
       </w:r>
     </w:p>
     <w:p>
@@ -244,8 +363,40 @@
           <w:sz w:val="24"/>
           <w:szCs w:val="24"/>
         </w:rPr>
-        <w:t>y para usar primero tendré que mostrar cuáles son las bases de datos que tengo y después usar el comando use.</w:t>
-      </w:r>
+        <w:t xml:space="preserve">Para usarlo, primero tendré que mostrar las bases de datos disponibles con el comando </w:t>
+      </w:r>
+      <w:proofErr w:type="gramStart"/>
+      <w:r>
+        <w:rPr>
+          <w:sz w:val="24"/>
+          <w:szCs w:val="24"/>
+        </w:rPr>
+        <w:t>SHOW</w:t>
+      </w:r>
+      <w:proofErr w:type="gramEnd"/>
+      <w:r>
+        <w:rPr>
+          <w:sz w:val="24"/>
+          <w:szCs w:val="24"/>
+        </w:rPr>
+        <w:t xml:space="preserve"> DATABASES, y luego seleccionar la base de datos que quiero utilizar con el comando USE.</w:t>
+      </w:r>
+    </w:p>
+    <w:p>
+      <w:pPr>
+        <w:rPr>
+          <w:sz w:val="24"/>
+          <w:szCs w:val="24"/>
+        </w:rPr>
+      </w:pPr>
+    </w:p>
+    <w:p>
+      <w:pPr>
+        <w:rPr>
+          <w:sz w:val="24"/>
+          <w:szCs w:val="24"/>
+        </w:rPr>
+      </w:pPr>
     </w:p>
     <w:p>
       <w:pPr>
@@ -260,7 +411,6 @@
           <w:sz w:val="24"/>
           <w:szCs w:val="24"/>
         </w:rPr>
-        <w:lastRenderedPageBreak/>
         <w:drawing>
           <wp:inline distT="0" distB="0" distL="0" distR="0" wp14:anchorId="79416791" wp14:editId="35C6C659">
             <wp:extent cx="1767840" cy="2529840"/>
@@ -313,44 +463,88 @@
     </w:p>
     <w:p>
       <w:pPr>
-        <w:pStyle w:val="ListParagraph"/>
-        <w:numPr>
-          <w:ilvl w:val="0"/>
-          <w:numId w:val="1"/>
-        </w:numPr>
-        <w:rPr>
-          <w:sz w:val="24"/>
-          <w:szCs w:val="24"/>
-        </w:rPr>
-      </w:pPr>
-      <w:r>
-        <w:rPr>
-          <w:sz w:val="24"/>
-          <w:szCs w:val="24"/>
-        </w:rPr>
-        <w:t>Ejercicio 2</w:t>
-      </w:r>
-    </w:p>
-    <w:p>
-      <w:pPr>
-        <w:rPr>
-          <w:sz w:val="24"/>
-          <w:szCs w:val="24"/>
-        </w:rPr>
-      </w:pPr>
-      <w:r>
-        <w:rPr>
-          <w:sz w:val="24"/>
-          <w:szCs w:val="24"/>
+        <w:rPr>
+          <w:b/>
+          <w:bCs/>
+          <w:i/>
+          <w:iCs/>
+          <w:sz w:val="28"/>
+          <w:szCs w:val="28"/>
+        </w:rPr>
+      </w:pPr>
+      <w:r>
+        <w:rPr>
+          <w:b/>
+          <w:bCs/>
+          <w:i/>
+          <w:iCs/>
+          <w:sz w:val="28"/>
+          <w:szCs w:val="28"/>
+        </w:rPr>
+        <w:t xml:space="preserve">2. Ahora escribe el comando para ver qué tablas tiene la base de datos </w:t>
+      </w:r>
+      <w:proofErr w:type="spellStart"/>
+      <w:r>
+        <w:rPr>
+          <w:b/>
+          <w:bCs/>
+          <w:i/>
+          <w:iCs/>
+          <w:sz w:val="28"/>
+          <w:szCs w:val="28"/>
+        </w:rPr>
+        <w:t>Classic</w:t>
+      </w:r>
+      <w:proofErr w:type="spellEnd"/>
+      <w:r>
+        <w:rPr>
+          <w:b/>
+          <w:bCs/>
+          <w:i/>
+          <w:iCs/>
+          <w:sz w:val="28"/>
+          <w:szCs w:val="28"/>
         </w:rPr>
         <w:t xml:space="preserve"> </w:t>
       </w:r>
-      <w:r>
-        <w:rPr>
-          <w:sz w:val="24"/>
-          <w:szCs w:val="24"/>
-        </w:rPr>
-        <w:t xml:space="preserve">Para ver las tablas de una base de datos, tendré que usar el comando </w:t>
+      <w:proofErr w:type="spellStart"/>
+      <w:r>
+        <w:rPr>
+          <w:b/>
+          <w:bCs/>
+          <w:i/>
+          <w:iCs/>
+          <w:sz w:val="28"/>
+          <w:szCs w:val="28"/>
+        </w:rPr>
+        <w:t>models</w:t>
+      </w:r>
+      <w:proofErr w:type="spellEnd"/>
+      <w:r>
+        <w:rPr>
+          <w:b/>
+          <w:bCs/>
+          <w:i/>
+          <w:iCs/>
+          <w:sz w:val="28"/>
+          <w:szCs w:val="28"/>
+        </w:rPr>
+        <w:t xml:space="preserve"> </w:t>
+      </w:r>
+    </w:p>
+    <w:p>
+      <w:pPr>
+        <w:rPr>
+          <w:sz w:val="24"/>
+          <w:szCs w:val="24"/>
+        </w:rPr>
+      </w:pPr>
+      <w:r>
+        <w:rPr>
+          <w:sz w:val="24"/>
+          <w:szCs w:val="24"/>
+        </w:rPr>
+        <w:t xml:space="preserve">Para ver las tablas de una base de datos, primero debo usar el comando USE (como se explicó en el Ejercicio 1) para seleccionar la base de datos, y luego utilizar el comando </w:t>
       </w:r>
       <w:proofErr w:type="gramStart"/>
       <w:r>
@@ -358,7 +552,7 @@
           <w:sz w:val="24"/>
           <w:szCs w:val="24"/>
         </w:rPr>
-        <w:t>show</w:t>
+        <w:t>SHOW</w:t>
       </w:r>
       <w:proofErr w:type="gramEnd"/>
       <w:r>
@@ -366,7 +560,7 @@
           <w:sz w:val="24"/>
           <w:szCs w:val="24"/>
         </w:rPr>
-        <w:t xml:space="preserve"> una vez a ver usado previamente el comando use del Ejercicio 1</w:t>
+        <w:t xml:space="preserve"> TABLES para listar las tablas de esa base de datos.</w:t>
       </w:r>
     </w:p>
     <w:p>
@@ -434,37 +628,84 @@
     </w:p>
     <w:p>
       <w:pPr>
-        <w:pStyle w:val="ListParagraph"/>
-        <w:numPr>
-          <w:ilvl w:val="0"/>
-          <w:numId w:val="1"/>
-        </w:numPr>
-        <w:rPr>
-          <w:sz w:val="24"/>
-          <w:szCs w:val="24"/>
-        </w:rPr>
-      </w:pPr>
-      <w:r>
-        <w:rPr>
-          <w:sz w:val="24"/>
-          <w:szCs w:val="24"/>
-        </w:rPr>
-        <w:t>Ejercicio 3</w:t>
-      </w:r>
-    </w:p>
-    <w:p>
-      <w:pPr>
-        <w:rPr>
-          <w:sz w:val="24"/>
-          <w:szCs w:val="24"/>
-        </w:rPr>
-      </w:pPr>
-      <w:r>
-        <w:rPr>
-          <w:sz w:val="24"/>
-          <w:szCs w:val="24"/>
-        </w:rPr>
-        <w:t>En este caso hemos utilizado la tabla products, para ver su esquema tendremos que usar el comando desc seguido del nombre de la tabla seleccionada</w:t>
+        <w:rPr>
+          <w:b/>
+          <w:bCs/>
+          <w:i/>
+          <w:iCs/>
+          <w:sz w:val="28"/>
+          <w:szCs w:val="28"/>
+        </w:rPr>
+      </w:pPr>
+      <w:r>
+        <w:rPr>
+          <w:b/>
+          <w:bCs/>
+          <w:i/>
+          <w:iCs/>
+          <w:sz w:val="28"/>
+          <w:szCs w:val="28"/>
+        </w:rPr>
+        <w:t>3. Elige una de las tablas o relaciones y muestra cuál es su esquema, es decir los campos que tiene y de qué tipo son.</w:t>
+      </w:r>
+    </w:p>
+    <w:p>
+      <w:pPr>
+        <w:rPr>
+          <w:sz w:val="24"/>
+          <w:szCs w:val="24"/>
+        </w:rPr>
+      </w:pPr>
+      <w:r>
+        <w:rPr>
+          <w:sz w:val="24"/>
+          <w:szCs w:val="24"/>
+        </w:rPr>
+        <w:t>En este caso, h</w:t>
+      </w:r>
+      <w:r>
+        <w:rPr>
+          <w:sz w:val="24"/>
+          <w:szCs w:val="24"/>
+        </w:rPr>
+        <w:t>e</w:t>
+      </w:r>
+      <w:r>
+        <w:rPr>
+          <w:sz w:val="24"/>
+          <w:szCs w:val="24"/>
+        </w:rPr>
+        <w:t xml:space="preserve"> utilizado la tabla </w:t>
+      </w:r>
+      <w:proofErr w:type="spellStart"/>
+      <w:r>
+        <w:rPr>
+          <w:sz w:val="24"/>
+          <w:szCs w:val="24"/>
+        </w:rPr>
+        <w:t>products</w:t>
+      </w:r>
+      <w:proofErr w:type="spellEnd"/>
+      <w:r>
+        <w:rPr>
+          <w:sz w:val="24"/>
+          <w:szCs w:val="24"/>
+        </w:rPr>
+        <w:t>. Para ver su esquema, deb</w:t>
+      </w:r>
+      <w:r>
+        <w:rPr>
+          <w:sz w:val="24"/>
+          <w:szCs w:val="24"/>
+        </w:rPr>
+        <w:t>o</w:t>
+      </w:r>
+      <w:r>
+        <w:rPr>
+          <w:sz w:val="24"/>
+          <w:szCs w:val="24"/>
+        </w:rPr>
+        <w:t xml:space="preserve"> usar el comando DESC seguido del nombre de la tabla seleccionada.</w:t>
       </w:r>
     </w:p>
     <w:p>
@@ -480,6 +721,7 @@
           <w:sz w:val="24"/>
           <w:szCs w:val="24"/>
         </w:rPr>
+        <w:lastRenderedPageBreak/>
         <w:drawing>
           <wp:inline distT="0" distB="0" distL="0" distR="0" wp14:anchorId="438EE0E1" wp14:editId="111D2F12">
             <wp:extent cx="4754880" cy="1432560"/>
@@ -532,54 +774,40 @@
     </w:p>
     <w:p>
       <w:pPr>
-        <w:pStyle w:val="ListParagraph"/>
-        <w:numPr>
-          <w:ilvl w:val="0"/>
-          <w:numId w:val="1"/>
-        </w:numPr>
-        <w:rPr>
-          <w:sz w:val="24"/>
-          <w:szCs w:val="24"/>
-        </w:rPr>
-      </w:pPr>
-      <w:r>
-        <w:rPr>
-          <w:sz w:val="24"/>
-          <w:szCs w:val="24"/>
-        </w:rPr>
-        <w:t>Ejercicio 4</w:t>
-      </w:r>
-    </w:p>
-    <w:p>
-      <w:pPr>
-        <w:rPr>
-          <w:sz w:val="24"/>
-          <w:szCs w:val="24"/>
-        </w:rPr>
-      </w:pPr>
-      <w:r>
-        <w:rPr>
-          <w:sz w:val="24"/>
-          <w:szCs w:val="24"/>
-        </w:rPr>
-        <w:lastRenderedPageBreak/>
-        <w:t xml:space="preserve">Vale, para insertar tuplas utilizaremos el comando insert, pero </w:t>
-      </w:r>
-      <w:proofErr w:type="gramStart"/>
-      <w:r>
-        <w:rPr>
-          <w:sz w:val="24"/>
-          <w:szCs w:val="24"/>
-        </w:rPr>
-        <w:t>tenemos que tener</w:t>
-      </w:r>
-      <w:proofErr w:type="gramEnd"/>
-      <w:r>
-        <w:rPr>
-          <w:sz w:val="24"/>
-          <w:szCs w:val="24"/>
-        </w:rPr>
-        <w:t xml:space="preserve"> en cuenta una cosa</w:t>
+        <w:rPr>
+          <w:b/>
+          <w:bCs/>
+          <w:i/>
+          <w:iCs/>
+          <w:sz w:val="28"/>
+          <w:szCs w:val="28"/>
+        </w:rPr>
+      </w:pPr>
+      <w:r>
+        <w:rPr>
+          <w:b/>
+          <w:bCs/>
+          <w:i/>
+          <w:iCs/>
+          <w:sz w:val="28"/>
+          <w:szCs w:val="28"/>
+        </w:rPr>
+        <w:t>4. En la tabla elegida inserta una nueva tupla con los valores elegidos por ti.</w:t>
+      </w:r>
+    </w:p>
+    <w:p>
+      <w:pPr>
+        <w:rPr>
+          <w:sz w:val="24"/>
+          <w:szCs w:val="24"/>
+        </w:rPr>
+      </w:pPr>
+      <w:r>
+        <w:rPr>
+          <w:sz w:val="24"/>
+          <w:szCs w:val="24"/>
+        </w:rPr>
+        <w:t>Para insertar tuplas, utilizaremos el comando INSERT, pero debemos tener en cuenta lo siguiente:</w:t>
       </w:r>
     </w:p>
     <w:p>
@@ -657,14 +885,189 @@
           <w:sz w:val="24"/>
           <w:szCs w:val="24"/>
         </w:rPr>
-        <w:t xml:space="preserve">Como vemos en checknumber hay una clave externa, es quiere decir que sólo podemos usar valores ya predefinidos en </w:t>
-      </w:r>
-      <w:r>
-        <w:rPr>
-          <w:sz w:val="24"/>
-          <w:szCs w:val="24"/>
-        </w:rPr>
-        <w:t>archivo, porque con clave externas conectamos tablas, como vemos más en grande aquí:</w:t>
+        <w:t>E</w:t>
+      </w:r>
+      <w:r>
+        <w:rPr>
+          <w:sz w:val="24"/>
+          <w:szCs w:val="24"/>
+        </w:rPr>
+        <w:t xml:space="preserve">l campo </w:t>
+      </w:r>
+      <w:proofErr w:type="spellStart"/>
+      <w:r>
+        <w:rPr>
+          <w:sz w:val="24"/>
+          <w:szCs w:val="24"/>
+        </w:rPr>
+        <w:t>customerNumber</w:t>
+      </w:r>
+      <w:proofErr w:type="spellEnd"/>
+      <w:r>
+        <w:rPr>
+          <w:sz w:val="24"/>
+          <w:szCs w:val="24"/>
+        </w:rPr>
+        <w:t xml:space="preserve"> es una </w:t>
+      </w:r>
+      <w:r>
+        <w:rPr>
+          <w:b/>
+          <w:bCs/>
+          <w:sz w:val="24"/>
+          <w:szCs w:val="24"/>
+        </w:rPr>
+        <w:t>clave externa</w:t>
+      </w:r>
+      <w:r>
+        <w:rPr>
+          <w:sz w:val="24"/>
+          <w:szCs w:val="24"/>
+        </w:rPr>
+        <w:t xml:space="preserve"> que referencia a la tabla </w:t>
+      </w:r>
+      <w:proofErr w:type="spellStart"/>
+      <w:r>
+        <w:rPr>
+          <w:b/>
+          <w:bCs/>
+          <w:sz w:val="24"/>
+          <w:szCs w:val="24"/>
+        </w:rPr>
+        <w:t>customers</w:t>
+      </w:r>
+      <w:proofErr w:type="spellEnd"/>
+      <w:r>
+        <w:rPr>
+          <w:sz w:val="24"/>
+          <w:szCs w:val="24"/>
+        </w:rPr>
+        <w:t>, lo que permite relacionar los pagos con sus respectivos clientes.</w:t>
+      </w:r>
+    </w:p>
+    <w:p>
+      <w:pPr>
+        <w:rPr>
+          <w:sz w:val="24"/>
+          <w:szCs w:val="24"/>
+        </w:rPr>
+      </w:pPr>
+      <w:r>
+        <w:rPr>
+          <w:sz w:val="24"/>
+          <w:szCs w:val="24"/>
+        </w:rPr>
+        <w:t xml:space="preserve">Esto significa que, al insertar un nuevo pago, el valor de </w:t>
+      </w:r>
+      <w:proofErr w:type="spellStart"/>
+      <w:r>
+        <w:rPr>
+          <w:sz w:val="24"/>
+          <w:szCs w:val="24"/>
+        </w:rPr>
+        <w:t>customerNumber</w:t>
+      </w:r>
+      <w:proofErr w:type="spellEnd"/>
+      <w:r>
+        <w:rPr>
+          <w:sz w:val="24"/>
+          <w:szCs w:val="24"/>
+        </w:rPr>
+        <w:t xml:space="preserve"> </w:t>
+      </w:r>
+      <w:r>
+        <w:rPr>
+          <w:b/>
+          <w:bCs/>
+          <w:sz w:val="24"/>
+          <w:szCs w:val="24"/>
+        </w:rPr>
+        <w:t xml:space="preserve">debe existir previamente en la tabla </w:t>
+      </w:r>
+      <w:proofErr w:type="spellStart"/>
+      <w:r>
+        <w:rPr>
+          <w:b/>
+          <w:bCs/>
+          <w:sz w:val="24"/>
+          <w:szCs w:val="24"/>
+        </w:rPr>
+        <w:t>customers</w:t>
+      </w:r>
+      <w:proofErr w:type="spellEnd"/>
+      <w:r>
+        <w:rPr>
+          <w:sz w:val="24"/>
+          <w:szCs w:val="24"/>
+        </w:rPr>
+        <w:t>, ya que las claves externas garantizan la integridad referencial entre tablas.</w:t>
+      </w:r>
+    </w:p>
+    <w:p>
+      <w:pPr>
+        <w:rPr>
+          <w:sz w:val="24"/>
+          <w:szCs w:val="24"/>
+        </w:rPr>
+      </w:pPr>
+      <w:r>
+        <w:rPr>
+          <w:sz w:val="24"/>
+          <w:szCs w:val="24"/>
+        </w:rPr>
+        <w:t xml:space="preserve">Como podemos ver en el diagrama, </w:t>
+      </w:r>
+      <w:proofErr w:type="spellStart"/>
+      <w:r>
+        <w:rPr>
+          <w:sz w:val="24"/>
+          <w:szCs w:val="24"/>
+        </w:rPr>
+        <w:t>customerNumber</w:t>
+      </w:r>
+      <w:proofErr w:type="spellEnd"/>
+      <w:r>
+        <w:rPr>
+          <w:sz w:val="24"/>
+          <w:szCs w:val="24"/>
+        </w:rPr>
+        <w:t xml:space="preserve"> aparece tanto en </w:t>
+      </w:r>
+      <w:proofErr w:type="spellStart"/>
+      <w:r>
+        <w:rPr>
+          <w:b/>
+          <w:bCs/>
+          <w:sz w:val="24"/>
+          <w:szCs w:val="24"/>
+        </w:rPr>
+        <w:t>customers</w:t>
+      </w:r>
+      <w:proofErr w:type="spellEnd"/>
+      <w:r>
+        <w:rPr>
+          <w:sz w:val="24"/>
+          <w:szCs w:val="24"/>
+        </w:rPr>
+        <w:t xml:space="preserve"> como en </w:t>
+      </w:r>
+      <w:proofErr w:type="spellStart"/>
+      <w:r>
+        <w:rPr>
+          <w:b/>
+          <w:bCs/>
+          <w:sz w:val="24"/>
+          <w:szCs w:val="24"/>
+        </w:rPr>
+        <w:t>payments</w:t>
+      </w:r>
+      <w:proofErr w:type="spellEnd"/>
+      <w:r>
+        <w:rPr>
+          <w:sz w:val="24"/>
+          <w:szCs w:val="24"/>
+        </w:rPr>
+        <w:t>, estableciendo una relación de uno a muchos: un cliente puede tener varios pagos, pero cada pago pertenece a un único cliente.</w:t>
       </w:r>
     </w:p>
     <w:p>
@@ -742,39 +1145,214 @@
           <w:sz w:val="24"/>
           <w:szCs w:val="24"/>
         </w:rPr>
-        <w:t xml:space="preserve">Y como vemos customerNumber aparece en 2 </w:t>
-      </w:r>
-      <w:proofErr w:type="gramStart"/>
-      <w:r>
-        <w:rPr>
-          <w:sz w:val="24"/>
-          <w:szCs w:val="24"/>
-        </w:rPr>
-        <w:t>tablas ,</w:t>
-      </w:r>
-      <w:proofErr w:type="gramEnd"/>
-      <w:r>
-        <w:rPr>
-          <w:sz w:val="24"/>
-          <w:szCs w:val="24"/>
-        </w:rPr>
-        <w:t xml:space="preserve"> en customers y payments, por lo </w:t>
-      </w:r>
-      <w:proofErr w:type="gramStart"/>
-      <w:r>
-        <w:rPr>
-          <w:sz w:val="24"/>
-          <w:szCs w:val="24"/>
-        </w:rPr>
-        <w:t>tanto</w:t>
-      </w:r>
-      <w:proofErr w:type="gramEnd"/>
-      <w:r>
-        <w:rPr>
-          <w:sz w:val="24"/>
-          <w:szCs w:val="24"/>
-        </w:rPr>
-        <w:t xml:space="preserve"> vamos a usar valores predefinidos para que no nos de error, para eso vamos a seleccionar todo lo que hay en payments con el select * from ___ en donde * = all.</w:t>
+        <w:t xml:space="preserve">Como </w:t>
+      </w:r>
+      <w:proofErr w:type="spellStart"/>
+      <w:r>
+        <w:rPr>
+          <w:b/>
+          <w:bCs/>
+          <w:sz w:val="24"/>
+          <w:szCs w:val="24"/>
+        </w:rPr>
+        <w:t>customerNumber</w:t>
+      </w:r>
+      <w:proofErr w:type="spellEnd"/>
+      <w:r>
+        <w:rPr>
+          <w:sz w:val="24"/>
+          <w:szCs w:val="24"/>
+        </w:rPr>
+        <w:t xml:space="preserve"> está presente tanto en la tabla </w:t>
+      </w:r>
+      <w:proofErr w:type="spellStart"/>
+      <w:r>
+        <w:rPr>
+          <w:sz w:val="24"/>
+          <w:szCs w:val="24"/>
+        </w:rPr>
+        <w:t>customers</w:t>
+      </w:r>
+      <w:proofErr w:type="spellEnd"/>
+      <w:r>
+        <w:rPr>
+          <w:sz w:val="24"/>
+          <w:szCs w:val="24"/>
+        </w:rPr>
+        <w:t xml:space="preserve"> como en la tabla </w:t>
+      </w:r>
+      <w:proofErr w:type="spellStart"/>
+      <w:r>
+        <w:rPr>
+          <w:sz w:val="24"/>
+          <w:szCs w:val="24"/>
+        </w:rPr>
+        <w:t>payments</w:t>
+      </w:r>
+      <w:proofErr w:type="spellEnd"/>
+      <w:r>
+        <w:rPr>
+          <w:sz w:val="24"/>
+          <w:szCs w:val="24"/>
+        </w:rPr>
+        <w:t xml:space="preserve">, debemos asegurarnos de usar un valor que ya exista en la tabla </w:t>
+      </w:r>
+      <w:proofErr w:type="spellStart"/>
+      <w:r>
+        <w:rPr>
+          <w:sz w:val="24"/>
+          <w:szCs w:val="24"/>
+        </w:rPr>
+        <w:t>customers</w:t>
+      </w:r>
+      <w:proofErr w:type="spellEnd"/>
+      <w:r>
+        <w:rPr>
+          <w:sz w:val="24"/>
+          <w:szCs w:val="24"/>
+        </w:rPr>
+        <w:t xml:space="preserve"> (es importante destacar que, si un valor de </w:t>
+      </w:r>
+      <w:proofErr w:type="spellStart"/>
+      <w:r>
+        <w:rPr>
+          <w:sz w:val="24"/>
+          <w:szCs w:val="24"/>
+        </w:rPr>
+        <w:t>customerNumber</w:t>
+      </w:r>
+      <w:proofErr w:type="spellEnd"/>
+      <w:r>
+        <w:rPr>
+          <w:sz w:val="24"/>
+          <w:szCs w:val="24"/>
+        </w:rPr>
+        <w:t xml:space="preserve"> existe en </w:t>
+      </w:r>
+      <w:proofErr w:type="spellStart"/>
+      <w:r>
+        <w:rPr>
+          <w:sz w:val="24"/>
+          <w:szCs w:val="24"/>
+        </w:rPr>
+        <w:t>payments</w:t>
+      </w:r>
+      <w:proofErr w:type="spellEnd"/>
+      <w:r>
+        <w:rPr>
+          <w:sz w:val="24"/>
+          <w:szCs w:val="24"/>
+        </w:rPr>
+        <w:t xml:space="preserve">, </w:t>
+      </w:r>
+      <w:r>
+        <w:rPr>
+          <w:sz w:val="24"/>
+          <w:szCs w:val="24"/>
+        </w:rPr>
+        <w:lastRenderedPageBreak/>
+        <w:t xml:space="preserve">también existirá en </w:t>
+      </w:r>
+      <w:proofErr w:type="spellStart"/>
+      <w:r>
+        <w:rPr>
+          <w:sz w:val="24"/>
+          <w:szCs w:val="24"/>
+        </w:rPr>
+        <w:t>customers</w:t>
+      </w:r>
+      <w:proofErr w:type="spellEnd"/>
+      <w:r>
+        <w:rPr>
+          <w:sz w:val="24"/>
+          <w:szCs w:val="24"/>
+        </w:rPr>
+        <w:t xml:space="preserve"> por la relación de clave externa</w:t>
+      </w:r>
+      <w:r>
+        <w:rPr>
+          <w:sz w:val="24"/>
+          <w:szCs w:val="24"/>
+        </w:rPr>
+        <w:t xml:space="preserve"> (a menos que se desactive dicha restricción referencial, se eliminen registros de </w:t>
+      </w:r>
+      <w:proofErr w:type="spellStart"/>
+      <w:r>
+        <w:rPr>
+          <w:sz w:val="24"/>
+          <w:szCs w:val="24"/>
+        </w:rPr>
+        <w:t>customers</w:t>
+      </w:r>
+      <w:proofErr w:type="spellEnd"/>
+      <w:r>
+        <w:rPr>
+          <w:sz w:val="24"/>
+          <w:szCs w:val="24"/>
+        </w:rPr>
+        <w:t xml:space="preserve"> o haya errores en la base de datos</w:t>
+      </w:r>
+      <w:r>
+        <w:rPr>
+          <w:sz w:val="24"/>
+          <w:szCs w:val="24"/>
+        </w:rPr>
+        <w:t>). Además, debemos garantizar que la combinación (</w:t>
+      </w:r>
+      <w:proofErr w:type="spellStart"/>
+      <w:r>
+        <w:rPr>
+          <w:sz w:val="24"/>
+          <w:szCs w:val="24"/>
+        </w:rPr>
+        <w:t>customerNumber</w:t>
+      </w:r>
+      <w:proofErr w:type="spellEnd"/>
+      <w:r>
+        <w:rPr>
+          <w:sz w:val="24"/>
+          <w:szCs w:val="24"/>
+        </w:rPr>
+        <w:t xml:space="preserve">, </w:t>
+      </w:r>
+      <w:proofErr w:type="spellStart"/>
+      <w:r>
+        <w:rPr>
+          <w:sz w:val="24"/>
+          <w:szCs w:val="24"/>
+        </w:rPr>
+        <w:t>checkNumber</w:t>
+      </w:r>
+      <w:proofErr w:type="spellEnd"/>
+      <w:r>
+        <w:rPr>
+          <w:sz w:val="24"/>
+          <w:szCs w:val="24"/>
+        </w:rPr>
+        <w:t xml:space="preserve">) sea única en la tabla </w:t>
+      </w:r>
+      <w:proofErr w:type="spellStart"/>
+      <w:r>
+        <w:rPr>
+          <w:sz w:val="24"/>
+          <w:szCs w:val="24"/>
+        </w:rPr>
+        <w:t>payments</w:t>
+      </w:r>
+      <w:proofErr w:type="spellEnd"/>
+      <w:r>
+        <w:rPr>
+          <w:sz w:val="24"/>
+          <w:szCs w:val="24"/>
+        </w:rPr>
+        <w:t>. Para revisar qué pagos ya existen, podemos consultar la tabla con</w:t>
+      </w:r>
+      <w:r>
+        <w:rPr>
+          <w:sz w:val="24"/>
+          <w:szCs w:val="24"/>
+        </w:rPr>
+        <w:t>:</w:t>
       </w:r>
     </w:p>
     <w:p>
@@ -852,7 +1430,7 @@
           <w:sz w:val="24"/>
           <w:szCs w:val="24"/>
         </w:rPr>
-        <w:t>Usaremos sólo los primeros registros porque había bastantes registros/tuplas.</w:t>
+        <w:t>Utilizaremos solo los primeros registros, ya que había un gran número de registros/tuplas.</w:t>
       </w:r>
     </w:p>
     <w:p>
@@ -868,7 +1446,6 @@
           <w:sz w:val="24"/>
           <w:szCs w:val="24"/>
         </w:rPr>
-        <w:lastRenderedPageBreak/>
         <w:drawing>
           <wp:inline distT="0" distB="0" distL="0" distR="0" wp14:anchorId="2B0BBA5C" wp14:editId="4C1E2449">
             <wp:extent cx="5090160" cy="762000"/>
@@ -931,7 +1508,23 @@
           <w:sz w:val="24"/>
           <w:szCs w:val="24"/>
         </w:rPr>
-        <w:t>Como vemos utilizamos el 103, que ya viene registrado en la tabla.</w:t>
+        <w:t xml:space="preserve">Como podemos ver, utilizamos el valor </w:t>
+      </w:r>
+      <w:r>
+        <w:rPr>
+          <w:b/>
+          <w:bCs/>
+          <w:sz w:val="24"/>
+          <w:szCs w:val="24"/>
+        </w:rPr>
+        <w:t>103</w:t>
+      </w:r>
+      <w:r>
+        <w:rPr>
+          <w:sz w:val="24"/>
+          <w:szCs w:val="24"/>
+        </w:rPr>
+        <w:t>, que ya está registrado en la tabla.</w:t>
       </w:r>
     </w:p>
     <w:p>
@@ -1062,84 +1655,71 @@
     </w:p>
     <w:p>
       <w:pPr>
-        <w:pStyle w:val="ListParagraph"/>
-        <w:numPr>
-          <w:ilvl w:val="0"/>
-          <w:numId w:val="1"/>
-        </w:numPr>
-        <w:rPr>
-          <w:sz w:val="24"/>
-          <w:szCs w:val="24"/>
-        </w:rPr>
-      </w:pPr>
-      <w:r>
-        <w:rPr>
-          <w:sz w:val="24"/>
-          <w:szCs w:val="24"/>
-        </w:rPr>
-        <w:t>Ejercicio 5</w:t>
-      </w:r>
-    </w:p>
-    <w:p>
-      <w:pPr>
-        <w:rPr>
-          <w:sz w:val="24"/>
-          <w:szCs w:val="24"/>
-        </w:rPr>
-      </w:pPr>
-      <w:r>
-        <w:rPr>
-          <w:sz w:val="24"/>
-          <w:szCs w:val="24"/>
-        </w:rPr>
-        <w:t>Aquí vamos a crear una tabla llamada typec</w:t>
-      </w:r>
-      <w:r>
-        <w:rPr>
-          <w:sz w:val="24"/>
-          <w:szCs w:val="24"/>
-        </w:rPr>
-        <w:t>u</w:t>
-      </w:r>
-      <w:r>
-        <w:rPr>
-          <w:sz w:val="24"/>
-          <w:szCs w:val="24"/>
-        </w:rPr>
-        <w:t>st</w:t>
-      </w:r>
-      <w:r>
-        <w:rPr>
-          <w:sz w:val="24"/>
-          <w:szCs w:val="24"/>
-        </w:rPr>
-        <w:t>o</w:t>
-      </w:r>
-      <w:r>
-        <w:rPr>
-          <w:sz w:val="24"/>
-          <w:szCs w:val="24"/>
-        </w:rPr>
-        <w:t>mers, yo le voy a asignar una</w:t>
-      </w:r>
-      <w:r>
-        <w:rPr>
-          <w:sz w:val="24"/>
-          <w:szCs w:val="24"/>
-        </w:rPr>
-        <w:t xml:space="preserve"> </w:t>
-      </w:r>
-      <w:r>
-        <w:rPr>
-          <w:sz w:val="24"/>
-          <w:szCs w:val="24"/>
-        </w:rPr>
-        <w:t>variable char llamada tipo</w:t>
-      </w:r>
-      <w:r>
-        <w:rPr>
-          <w:sz w:val="24"/>
-          <w:szCs w:val="24"/>
+        <w:rPr>
+          <w:b/>
+          <w:bCs/>
+          <w:i/>
+          <w:iCs/>
+          <w:sz w:val="28"/>
+          <w:szCs w:val="28"/>
+        </w:rPr>
+      </w:pPr>
+      <w:r>
+        <w:rPr>
+          <w:b/>
+          <w:bCs/>
+          <w:i/>
+          <w:iCs/>
+          <w:sz w:val="28"/>
+          <w:szCs w:val="28"/>
+        </w:rPr>
+        <w:t xml:space="preserve">5. Crea una nueva tabla llamada </w:t>
+      </w:r>
+      <w:proofErr w:type="spellStart"/>
+      <w:r>
+        <w:rPr>
+          <w:b/>
+          <w:bCs/>
+          <w:i/>
+          <w:iCs/>
+          <w:sz w:val="28"/>
+          <w:szCs w:val="28"/>
+        </w:rPr>
+        <w:t>typecustomers</w:t>
+      </w:r>
+      <w:proofErr w:type="spellEnd"/>
+      <w:r>
+        <w:rPr>
+          <w:b/>
+          <w:bCs/>
+          <w:i/>
+          <w:iCs/>
+          <w:sz w:val="28"/>
+          <w:szCs w:val="28"/>
+        </w:rPr>
+        <w:t xml:space="preserve"> con un único atributo que se llame tipo esa variable va a ser de tipo </w:t>
+      </w:r>
+      <w:proofErr w:type="spellStart"/>
+      <w:r>
+        <w:rPr>
+          <w:b/>
+          <w:bCs/>
+          <w:i/>
+          <w:iCs/>
+          <w:sz w:val="28"/>
+          <w:szCs w:val="28"/>
+        </w:rPr>
+        <w:t>char</w:t>
+      </w:r>
+      <w:proofErr w:type="spellEnd"/>
+      <w:r>
+        <w:rPr>
+          <w:b/>
+          <w:bCs/>
+          <w:i/>
+          <w:iCs/>
+          <w:sz w:val="28"/>
+          <w:szCs w:val="28"/>
         </w:rPr>
         <w:t>.</w:t>
       </w:r>
@@ -1156,7 +1736,23 @@
           <w:sz w:val="24"/>
           <w:szCs w:val="24"/>
         </w:rPr>
-        <w:t>Para ello utilizaré el comando create table</w:t>
+        <w:t xml:space="preserve">En este caso, vamos a crear una tabla llamada </w:t>
+      </w:r>
+      <w:proofErr w:type="spellStart"/>
+      <w:r>
+        <w:rPr>
+          <w:sz w:val="24"/>
+          <w:szCs w:val="24"/>
+        </w:rPr>
+        <w:t>typecustomers</w:t>
+      </w:r>
+      <w:proofErr w:type="spellEnd"/>
+      <w:r>
+        <w:rPr>
+          <w:sz w:val="24"/>
+          <w:szCs w:val="24"/>
+        </w:rPr>
+        <w:t>, a la cual le asignaré una columna de tipo CHAR llamada tipo. Para ello, utilizaré el comando CREATE TABLE.</w:t>
       </w:r>
     </w:p>
     <w:p>
@@ -1172,6 +1768,7 @@
           <w:sz w:val="24"/>
           <w:szCs w:val="24"/>
         </w:rPr>
+        <w:lastRenderedPageBreak/>
         <w:drawing>
           <wp:inline distT="0" distB="0" distL="0" distR="0" wp14:anchorId="6D247B15" wp14:editId="37257664">
             <wp:extent cx="3413760" cy="411480"/>
@@ -1224,37 +1821,95 @@
     </w:p>
     <w:p>
       <w:pPr>
-        <w:pStyle w:val="ListParagraph"/>
-        <w:numPr>
-          <w:ilvl w:val="0"/>
-          <w:numId w:val="1"/>
-        </w:numPr>
-        <w:rPr>
-          <w:sz w:val="24"/>
-          <w:szCs w:val="24"/>
-        </w:rPr>
-      </w:pPr>
-      <w:r>
-        <w:rPr>
-          <w:sz w:val="24"/>
-          <w:szCs w:val="24"/>
-        </w:rPr>
-        <w:t>Ejercicio 6</w:t>
-      </w:r>
-    </w:p>
-    <w:p>
-      <w:pPr>
-        <w:rPr>
-          <w:sz w:val="24"/>
-          <w:szCs w:val="24"/>
-        </w:rPr>
-      </w:pPr>
-      <w:r>
-        <w:rPr>
-          <w:sz w:val="24"/>
-          <w:szCs w:val="24"/>
-        </w:rPr>
-        <w:t xml:space="preserve">     Y aquí mostraré las tablas, para ver si ha habido alguna modificación</w:t>
+        <w:rPr>
+          <w:b/>
+          <w:bCs/>
+          <w:i/>
+          <w:iCs/>
+          <w:sz w:val="28"/>
+          <w:szCs w:val="28"/>
+        </w:rPr>
+      </w:pPr>
+      <w:r>
+        <w:rPr>
+          <w:b/>
+          <w:bCs/>
+          <w:i/>
+          <w:iCs/>
+          <w:sz w:val="28"/>
+          <w:szCs w:val="28"/>
+        </w:rPr>
+        <w:t xml:space="preserve">6. Muestra ahora de nuevo las tablas de la base de datos </w:t>
+      </w:r>
+      <w:proofErr w:type="spellStart"/>
+      <w:r>
+        <w:rPr>
+          <w:b/>
+          <w:bCs/>
+          <w:i/>
+          <w:iCs/>
+          <w:sz w:val="28"/>
+          <w:szCs w:val="28"/>
+        </w:rPr>
+        <w:t>Classic</w:t>
+      </w:r>
+      <w:proofErr w:type="spellEnd"/>
+      <w:r>
+        <w:rPr>
+          <w:b/>
+          <w:bCs/>
+          <w:i/>
+          <w:iCs/>
+          <w:sz w:val="28"/>
+          <w:szCs w:val="28"/>
+        </w:rPr>
+        <w:t xml:space="preserve"> </w:t>
+      </w:r>
+      <w:proofErr w:type="spellStart"/>
+      <w:r>
+        <w:rPr>
+          <w:b/>
+          <w:bCs/>
+          <w:i/>
+          <w:iCs/>
+          <w:sz w:val="28"/>
+          <w:szCs w:val="28"/>
+        </w:rPr>
+        <w:t>models</w:t>
+      </w:r>
+      <w:proofErr w:type="spellEnd"/>
+      <w:r>
+        <w:rPr>
+          <w:b/>
+          <w:bCs/>
+          <w:i/>
+          <w:iCs/>
+          <w:sz w:val="28"/>
+          <w:szCs w:val="28"/>
+        </w:rPr>
+        <w:t xml:space="preserve"> para ver qué se ha creado correctamente esa nueva tabla.</w:t>
+      </w:r>
+    </w:p>
+    <w:p>
+      <w:pPr>
+        <w:rPr>
+          <w:sz w:val="24"/>
+          <w:szCs w:val="24"/>
+        </w:rPr>
+      </w:pPr>
+      <w:r>
+        <w:rPr>
+          <w:sz w:val="24"/>
+          <w:szCs w:val="24"/>
+        </w:rPr>
+        <w:t xml:space="preserve">A </w:t>
+      </w:r>
+      <w:r>
+        <w:rPr>
+          <w:sz w:val="24"/>
+          <w:szCs w:val="24"/>
+        </w:rPr>
+        <w:t>continuación, mostraré las tablas para comprobar si se ha producido alguna modificación.</w:t>
       </w:r>
     </w:p>
     <w:p>
@@ -1333,7 +1988,6 @@
           <w:sz w:val="24"/>
           <w:szCs w:val="24"/>
         </w:rPr>
-        <w:lastRenderedPageBreak/>
         <w:drawing>
           <wp:inline distT="0" distB="0" distL="0" distR="0" wp14:anchorId="369E51A8" wp14:editId="2B6E27D7">
             <wp:extent cx="3505200" cy="1226820"/>
@@ -1396,142 +2050,137 @@
           <w:sz w:val="24"/>
           <w:szCs w:val="24"/>
         </w:rPr>
-        <w:t>Como vemos se ha añadido la nueva tabla typec</w:t>
-      </w:r>
-      <w:r>
-        <w:rPr>
-          <w:sz w:val="24"/>
-          <w:szCs w:val="24"/>
-        </w:rPr>
-        <w:t>u</w:t>
-      </w:r>
-      <w:r>
-        <w:rPr>
-          <w:sz w:val="24"/>
-          <w:szCs w:val="24"/>
-        </w:rPr>
-        <w:t>st</w:t>
-      </w:r>
-      <w:r>
-        <w:rPr>
-          <w:sz w:val="24"/>
-          <w:szCs w:val="24"/>
-        </w:rPr>
-        <w:t>o</w:t>
-      </w:r>
-      <w:r>
-        <w:rPr>
-          <w:sz w:val="24"/>
-          <w:szCs w:val="24"/>
-        </w:rPr>
-        <w:t>mers.</w:t>
-      </w:r>
-    </w:p>
-    <w:p>
-      <w:pPr>
-        <w:pStyle w:val="ListParagraph"/>
-        <w:numPr>
-          <w:ilvl w:val="0"/>
-          <w:numId w:val="1"/>
-        </w:numPr>
-        <w:rPr>
-          <w:sz w:val="24"/>
-          <w:szCs w:val="24"/>
-        </w:rPr>
-      </w:pPr>
-      <w:r>
-        <w:rPr>
-          <w:sz w:val="24"/>
-          <w:szCs w:val="24"/>
-        </w:rPr>
-        <w:t>Ejercicio 7</w:t>
-      </w:r>
-    </w:p>
-    <w:p>
-      <w:pPr>
-        <w:rPr>
-          <w:sz w:val="24"/>
-          <w:szCs w:val="24"/>
-        </w:rPr>
-      </w:pPr>
-      <w:r>
-        <w:rPr>
-          <w:sz w:val="24"/>
-          <w:szCs w:val="24"/>
-        </w:rPr>
-        <w:t>Y ahora vamos a renombrar la tabla typec</w:t>
-      </w:r>
-      <w:r>
-        <w:rPr>
-          <w:sz w:val="24"/>
-          <w:szCs w:val="24"/>
-        </w:rPr>
-        <w:t>u</w:t>
-      </w:r>
-      <w:r>
-        <w:rPr>
-          <w:sz w:val="24"/>
-          <w:szCs w:val="24"/>
-        </w:rPr>
-        <w:t>st</w:t>
-      </w:r>
-      <w:r>
-        <w:rPr>
-          <w:sz w:val="24"/>
-          <w:szCs w:val="24"/>
-        </w:rPr>
-        <w:t>o</w:t>
-      </w:r>
-      <w:r>
-        <w:rPr>
-          <w:sz w:val="24"/>
-          <w:szCs w:val="24"/>
-        </w:rPr>
-        <w:t>mers a type_c</w:t>
-      </w:r>
-      <w:r>
-        <w:rPr>
-          <w:sz w:val="24"/>
-          <w:szCs w:val="24"/>
-        </w:rPr>
-        <w:t>u</w:t>
-      </w:r>
-      <w:r>
-        <w:rPr>
-          <w:sz w:val="24"/>
-          <w:szCs w:val="24"/>
-        </w:rPr>
-        <w:t>st</w:t>
-      </w:r>
-      <w:r>
-        <w:rPr>
-          <w:sz w:val="24"/>
-          <w:szCs w:val="24"/>
-        </w:rPr>
-        <w:t>o</w:t>
-      </w:r>
-      <w:r>
-        <w:rPr>
-          <w:sz w:val="24"/>
-          <w:szCs w:val="24"/>
-        </w:rPr>
-        <w:t>mers, como haremos eso, muy fácil, lo haremos con el comando rename table __</w:t>
-      </w:r>
-      <w:proofErr w:type="gramStart"/>
-      <w:r>
-        <w:rPr>
-          <w:sz w:val="24"/>
-          <w:szCs w:val="24"/>
-        </w:rPr>
-        <w:t>_  to</w:t>
-      </w:r>
-      <w:proofErr w:type="gramEnd"/>
-      <w:r>
-        <w:rPr>
-          <w:sz w:val="24"/>
-          <w:szCs w:val="24"/>
-        </w:rPr>
-        <w:t xml:space="preserve">  ____</w:t>
+        <w:t xml:space="preserve">Como podemos observar, se ha añadido la nueva tabla </w:t>
+      </w:r>
+      <w:proofErr w:type="spellStart"/>
+      <w:r>
+        <w:rPr>
+          <w:sz w:val="24"/>
+          <w:szCs w:val="24"/>
+        </w:rPr>
+        <w:t>typecustomers</w:t>
+      </w:r>
+      <w:proofErr w:type="spellEnd"/>
+      <w:r>
+        <w:rPr>
+          <w:sz w:val="24"/>
+          <w:szCs w:val="24"/>
+        </w:rPr>
+        <w:t>.</w:t>
+      </w:r>
+    </w:p>
+    <w:p>
+      <w:pPr>
+        <w:rPr>
+          <w:b/>
+          <w:bCs/>
+          <w:i/>
+          <w:iCs/>
+          <w:sz w:val="28"/>
+          <w:szCs w:val="28"/>
+        </w:rPr>
+      </w:pPr>
+      <w:r>
+        <w:rPr>
+          <w:b/>
+          <w:bCs/>
+          <w:i/>
+          <w:iCs/>
+          <w:sz w:val="28"/>
+          <w:szCs w:val="28"/>
+        </w:rPr>
+        <w:t xml:space="preserve">7. Renombra la tabla </w:t>
+      </w:r>
+      <w:proofErr w:type="spellStart"/>
+      <w:r>
+        <w:rPr>
+          <w:b/>
+          <w:bCs/>
+          <w:i/>
+          <w:iCs/>
+          <w:sz w:val="28"/>
+          <w:szCs w:val="28"/>
+        </w:rPr>
+        <w:t>typecustomers</w:t>
+      </w:r>
+      <w:proofErr w:type="spellEnd"/>
+      <w:r>
+        <w:rPr>
+          <w:b/>
+          <w:bCs/>
+          <w:i/>
+          <w:iCs/>
+          <w:sz w:val="28"/>
+          <w:szCs w:val="28"/>
+        </w:rPr>
+        <w:t xml:space="preserve"> a </w:t>
+      </w:r>
+      <w:proofErr w:type="spellStart"/>
+      <w:r>
+        <w:rPr>
+          <w:b/>
+          <w:bCs/>
+          <w:i/>
+          <w:iCs/>
+          <w:sz w:val="28"/>
+          <w:szCs w:val="28"/>
+        </w:rPr>
+        <w:t>type_customers</w:t>
+      </w:r>
+      <w:proofErr w:type="spellEnd"/>
+    </w:p>
+    <w:p>
+      <w:pPr>
+        <w:rPr>
+          <w:sz w:val="24"/>
+          <w:szCs w:val="24"/>
+        </w:rPr>
+      </w:pPr>
+      <w:r>
+        <w:rPr>
+          <w:sz w:val="24"/>
+          <w:szCs w:val="24"/>
+        </w:rPr>
+        <w:t>A</w:t>
+      </w:r>
+      <w:r>
+        <w:rPr>
+          <w:sz w:val="24"/>
+          <w:szCs w:val="24"/>
+        </w:rPr>
+        <w:t xml:space="preserve">hora vamos a renombrar la tabla </w:t>
+      </w:r>
+      <w:proofErr w:type="spellStart"/>
+      <w:r>
+        <w:rPr>
+          <w:sz w:val="24"/>
+          <w:szCs w:val="24"/>
+        </w:rPr>
+        <w:t>typecustomers</w:t>
+      </w:r>
+      <w:proofErr w:type="spellEnd"/>
+      <w:r>
+        <w:rPr>
+          <w:sz w:val="24"/>
+          <w:szCs w:val="24"/>
+        </w:rPr>
+        <w:t xml:space="preserve"> a </w:t>
+      </w:r>
+      <w:proofErr w:type="spellStart"/>
+      <w:r>
+        <w:rPr>
+          <w:sz w:val="24"/>
+          <w:szCs w:val="24"/>
+        </w:rPr>
+        <w:t>type_customers</w:t>
+      </w:r>
+      <w:proofErr w:type="spellEnd"/>
+      <w:r>
+        <w:rPr>
+          <w:sz w:val="24"/>
+          <w:szCs w:val="24"/>
+        </w:rPr>
+        <w:t>. ¿Cómo lo haremos? Muy fácil, utilizaremos el comando RENAME TABLE ___ TO ___.</w:t>
       </w:r>
     </w:p>
     <w:p>
@@ -1599,59 +2248,74 @@
     </w:p>
     <w:p>
       <w:pPr>
-        <w:pStyle w:val="ListParagraph"/>
-        <w:numPr>
-          <w:ilvl w:val="0"/>
-          <w:numId w:val="1"/>
-        </w:numPr>
-        <w:rPr>
-          <w:sz w:val="24"/>
-          <w:szCs w:val="24"/>
-        </w:rPr>
-      </w:pPr>
-      <w:r>
-        <w:rPr>
-          <w:sz w:val="24"/>
-          <w:szCs w:val="24"/>
-        </w:rPr>
-        <w:t>Ejercicio 8</w:t>
-      </w:r>
-    </w:p>
-    <w:p>
-      <w:pPr>
-        <w:rPr>
-          <w:sz w:val="24"/>
-          <w:szCs w:val="24"/>
-        </w:rPr>
-      </w:pPr>
-      <w:r>
-        <w:rPr>
-          <w:sz w:val="24"/>
-          <w:szCs w:val="24"/>
-        </w:rPr>
-        <w:t>En este caso haremos una cosa, por poner un ejemplo, se nos ha olvidado añadir una fila/tupla que es importante en nuestra tabla, ¿cómo hacemos para modificar esa tabla sin tener que crear una tabla nueva con los nuevos valores?</w:t>
-      </w:r>
-    </w:p>
-    <w:p>
-      <w:pPr>
-        <w:rPr>
-          <w:sz w:val="24"/>
-          <w:szCs w:val="24"/>
-        </w:rPr>
-      </w:pPr>
-      <w:r>
-        <w:rPr>
-          <w:sz w:val="24"/>
-          <w:szCs w:val="24"/>
-        </w:rPr>
-        <w:t xml:space="preserve">Pues bien, fácil, vamos a utilizar el comando alter table ____ add ____ para alterar la tabla y modificarla a nuestro estilo, </w:t>
-      </w:r>
-      <w:r>
-        <w:rPr>
-          <w:sz w:val="24"/>
-          <w:szCs w:val="24"/>
-        </w:rPr>
-        <w:t>y le vamos a poner por ejemplo una nueva tupla con un atributo llamado descripción de tipo cadena de caracteres</w:t>
+        <w:rPr>
+          <w:b/>
+          <w:bCs/>
+          <w:i/>
+          <w:iCs/>
+          <w:sz w:val="28"/>
+          <w:szCs w:val="28"/>
+        </w:rPr>
+      </w:pPr>
+      <w:r>
+        <w:rPr>
+          <w:b/>
+          <w:bCs/>
+          <w:i/>
+          <w:iCs/>
+          <w:sz w:val="28"/>
+          <w:szCs w:val="28"/>
+        </w:rPr>
+        <w:t xml:space="preserve">8. Modifica el esquema de la tabla </w:t>
+      </w:r>
+      <w:proofErr w:type="spellStart"/>
+      <w:r>
+        <w:rPr>
+          <w:b/>
+          <w:bCs/>
+          <w:i/>
+          <w:iCs/>
+          <w:sz w:val="28"/>
+          <w:szCs w:val="28"/>
+        </w:rPr>
+        <w:t>type_customers</w:t>
+      </w:r>
+      <w:proofErr w:type="spellEnd"/>
+      <w:r>
+        <w:rPr>
+          <w:b/>
+          <w:bCs/>
+          <w:i/>
+          <w:iCs/>
+          <w:sz w:val="28"/>
+          <w:szCs w:val="28"/>
+        </w:rPr>
+        <w:t xml:space="preserve"> de tal manera que le añadas un nuevo atributo que es descripción y cuyo tipo es cadena de caracteres.</w:t>
+      </w:r>
+    </w:p>
+    <w:p>
+      <w:r>
+        <w:rPr>
+          <w:sz w:val="24"/>
+          <w:szCs w:val="24"/>
+        </w:rPr>
+        <w:t>En este caso, supongamos que hemos olvidado añadir una fila/tupla importante en nuestra tabla. ¿Cómo podemos modificar la tabla sin tener que crear una nueva con los nuevos valores?</w:t>
+      </w:r>
+    </w:p>
+    <w:p>
+      <w:pPr>
+        <w:rPr>
+          <w:sz w:val="24"/>
+          <w:szCs w:val="24"/>
+        </w:rPr>
+      </w:pPr>
+      <w:r>
+        <w:rPr>
+          <w:sz w:val="24"/>
+          <w:szCs w:val="24"/>
+        </w:rPr>
+        <w:lastRenderedPageBreak/>
+        <w:t>Pues bien, es muy sencillo. Vamos a utilizar el comando ALTER TABLE ___ ADD ___ para alterar la tabla y modificarla según nuestras necesidades. Por ejemplo, vamos a agregar una nueva tupla con un atributo llamado descripción, de tipo cadena de caracteres.</w:t>
       </w:r>
     </w:p>
     <w:p>
@@ -1719,37 +2383,64 @@
     </w:p>
     <w:p>
       <w:pPr>
-        <w:pStyle w:val="ListParagraph"/>
-        <w:numPr>
-          <w:ilvl w:val="0"/>
-          <w:numId w:val="1"/>
-        </w:numPr>
-        <w:rPr>
-          <w:sz w:val="24"/>
-          <w:szCs w:val="24"/>
-        </w:rPr>
-      </w:pPr>
-      <w:r>
-        <w:rPr>
-          <w:sz w:val="24"/>
-          <w:szCs w:val="24"/>
-        </w:rPr>
-        <w:t>Ejercicio 9</w:t>
-      </w:r>
-    </w:p>
-    <w:p>
-      <w:pPr>
-        <w:rPr>
-          <w:sz w:val="24"/>
-          <w:szCs w:val="24"/>
-        </w:rPr>
-      </w:pPr>
-      <w:r>
-        <w:rPr>
-          <w:sz w:val="24"/>
-          <w:szCs w:val="24"/>
-        </w:rPr>
-        <w:t>Y ahora vamos a ver las modificaciones en la tabla con el desc que hemos utilizado anteriormente</w:t>
+        <w:rPr>
+          <w:b/>
+          <w:bCs/>
+          <w:i/>
+          <w:iCs/>
+          <w:sz w:val="28"/>
+          <w:szCs w:val="28"/>
+        </w:rPr>
+      </w:pPr>
+      <w:r>
+        <w:rPr>
+          <w:b/>
+          <w:bCs/>
+          <w:i/>
+          <w:iCs/>
+          <w:sz w:val="28"/>
+          <w:szCs w:val="28"/>
+        </w:rPr>
+        <w:t xml:space="preserve">9. Muestra ahora con comando el esquema que tiene </w:t>
+      </w:r>
+      <w:proofErr w:type="spellStart"/>
+      <w:r>
+        <w:rPr>
+          <w:b/>
+          <w:bCs/>
+          <w:i/>
+          <w:iCs/>
+          <w:sz w:val="28"/>
+          <w:szCs w:val="28"/>
+        </w:rPr>
+        <w:t>type_customers</w:t>
+      </w:r>
+      <w:proofErr w:type="spellEnd"/>
+      <w:r>
+        <w:rPr>
+          <w:b/>
+          <w:bCs/>
+          <w:i/>
+          <w:iCs/>
+          <w:sz w:val="28"/>
+          <w:szCs w:val="28"/>
+        </w:rPr>
+        <w:t xml:space="preserve"> para que se vean correctamente los atributos definitivos.</w:t>
+      </w:r>
+    </w:p>
+    <w:p>
+      <w:pPr>
+        <w:rPr>
+          <w:sz w:val="24"/>
+          <w:szCs w:val="24"/>
+        </w:rPr>
+      </w:pPr>
+      <w:r>
+        <w:rPr>
+          <w:sz w:val="24"/>
+          <w:szCs w:val="24"/>
+        </w:rPr>
+        <w:t>Ahora vamos a ver las modificaciones en la tabla utilizando el comando DESC, como lo hicimos anteriormente.</w:t>
       </w:r>
     </w:p>
     <w:p>
@@ -1817,72 +2508,65 @@
     </w:p>
     <w:p>
       <w:pPr>
-        <w:pStyle w:val="ListParagraph"/>
-        <w:numPr>
-          <w:ilvl w:val="0"/>
-          <w:numId w:val="1"/>
-        </w:numPr>
-        <w:rPr>
-          <w:sz w:val="24"/>
-          <w:szCs w:val="24"/>
-        </w:rPr>
-      </w:pPr>
-      <w:r>
-        <w:rPr>
-          <w:sz w:val="24"/>
-          <w:szCs w:val="24"/>
-        </w:rPr>
-        <w:t>Ejercicio 10</w:t>
-      </w:r>
-    </w:p>
-    <w:p>
-      <w:pPr>
-        <w:rPr>
-          <w:sz w:val="24"/>
-          <w:szCs w:val="24"/>
-        </w:rPr>
-      </w:pPr>
-      <w:r>
-        <w:rPr>
-          <w:sz w:val="24"/>
-          <w:szCs w:val="24"/>
-        </w:rPr>
-        <w:t>Ahora crearemos 3 nuevas tuplas en nuestra tabla type_c</w:t>
-      </w:r>
-      <w:r>
-        <w:rPr>
-          <w:sz w:val="24"/>
-          <w:szCs w:val="24"/>
-        </w:rPr>
-        <w:t>u</w:t>
-      </w:r>
-      <w:r>
-        <w:rPr>
-          <w:sz w:val="24"/>
-          <w:szCs w:val="24"/>
-        </w:rPr>
-        <w:t>st</w:t>
-      </w:r>
-      <w:r>
-        <w:rPr>
-          <w:sz w:val="24"/>
-          <w:szCs w:val="24"/>
-        </w:rPr>
-        <w:t>o</w:t>
-      </w:r>
-      <w:r>
-        <w:rPr>
-          <w:sz w:val="24"/>
-          <w:szCs w:val="24"/>
-        </w:rPr>
-        <w:t>mers</w:t>
-      </w:r>
-      <w:r>
-        <w:rPr>
-          <w:sz w:val="24"/>
-          <w:szCs w:val="24"/>
-        </w:rPr>
-        <w:t>, muy fácil, otra vez a usar el comando insert.</w:t>
+        <w:rPr>
+          <w:sz w:val="24"/>
+          <w:szCs w:val="24"/>
+        </w:rPr>
+      </w:pPr>
+      <w:r>
+        <w:rPr>
+          <w:b/>
+          <w:bCs/>
+          <w:i/>
+          <w:iCs/>
+          <w:sz w:val="28"/>
+          <w:szCs w:val="28"/>
+        </w:rPr>
+        <w:t xml:space="preserve">10. Crea 3 tuplas en la nueva tabla </w:t>
+      </w:r>
+      <w:proofErr w:type="spellStart"/>
+      <w:r>
+        <w:rPr>
+          <w:b/>
+          <w:bCs/>
+          <w:i/>
+          <w:iCs/>
+          <w:sz w:val="28"/>
+          <w:szCs w:val="28"/>
+        </w:rPr>
+        <w:t>type_customers</w:t>
+      </w:r>
+      <w:proofErr w:type="spellEnd"/>
+    </w:p>
+    <w:p>
+      <w:pPr>
+        <w:rPr>
+          <w:sz w:val="24"/>
+          <w:szCs w:val="24"/>
+        </w:rPr>
+      </w:pPr>
+      <w:r>
+        <w:rPr>
+          <w:sz w:val="24"/>
+          <w:szCs w:val="24"/>
+        </w:rPr>
+        <w:t xml:space="preserve">Ahora crearemos 3 nuevas tuplas en nuestra tabla </w:t>
+      </w:r>
+      <w:proofErr w:type="spellStart"/>
+      <w:r>
+        <w:rPr>
+          <w:sz w:val="24"/>
+          <w:szCs w:val="24"/>
+        </w:rPr>
+        <w:t>type_customers</w:t>
+      </w:r>
+      <w:proofErr w:type="spellEnd"/>
+      <w:r>
+        <w:rPr>
+          <w:sz w:val="24"/>
+          <w:szCs w:val="24"/>
+        </w:rPr>
+        <w:t>. Es muy sencillo, simplemente utilizaremos nuevamente el comando INSERT.</w:t>
       </w:r>
     </w:p>
     <w:p>
@@ -1898,7 +2582,6 @@
           <w:sz w:val="24"/>
           <w:szCs w:val="24"/>
         </w:rPr>
-        <w:lastRenderedPageBreak/>
         <w:drawing>
           <wp:inline distT="0" distB="0" distL="0" distR="0" wp14:anchorId="3F21FC5E" wp14:editId="19A30C52">
             <wp:extent cx="3970020" cy="1295400"/>
@@ -1951,87 +2634,286 @@
     </w:p>
     <w:p>
       <w:pPr>
-        <w:pStyle w:val="ListParagraph"/>
-        <w:numPr>
-          <w:ilvl w:val="0"/>
-          <w:numId w:val="1"/>
-        </w:numPr>
-        <w:rPr>
-          <w:sz w:val="24"/>
-          <w:szCs w:val="24"/>
-        </w:rPr>
-      </w:pPr>
-      <w:r>
-        <w:rPr>
-          <w:sz w:val="24"/>
-          <w:szCs w:val="24"/>
-        </w:rPr>
-        <w:t>Ejercicio 11</w:t>
-      </w:r>
-    </w:p>
-    <w:p>
-      <w:pPr>
-        <w:rPr>
-          <w:sz w:val="24"/>
-          <w:szCs w:val="24"/>
-        </w:rPr>
-      </w:pPr>
-      <w:r>
-        <w:rPr>
-          <w:sz w:val="24"/>
-          <w:szCs w:val="24"/>
-        </w:rPr>
-        <w:t>Crearemos una nueva tabla que tenga como variables, variables que concuerden en los tipos de datos de las variables clave</w:t>
-      </w:r>
-      <w:r>
-        <w:rPr>
-          <w:sz w:val="24"/>
-          <w:szCs w:val="24"/>
-        </w:rPr>
-        <w:t xml:space="preserve"> primaria</w:t>
-      </w:r>
-      <w:r>
-        <w:rPr>
-          <w:sz w:val="24"/>
-          <w:szCs w:val="24"/>
-        </w:rPr>
-        <w:t xml:space="preserve"> que tenemos en nues</w:t>
-      </w:r>
-      <w:r>
-        <w:rPr>
-          <w:sz w:val="24"/>
-          <w:szCs w:val="24"/>
-        </w:rPr>
-        <w:t>tras tablas a enlazar</w:t>
-      </w:r>
-    </w:p>
-    <w:p>
-      <w:pPr>
-        <w:rPr>
-          <w:sz w:val="24"/>
-          <w:szCs w:val="24"/>
-        </w:rPr>
-      </w:pPr>
-      <w:r>
-        <w:rPr>
-          <w:sz w:val="24"/>
-          <w:szCs w:val="24"/>
-        </w:rPr>
-        <w:t>Pero antes que eso, asignaré una columna que tengo en mi tabla type_customers como clave primaria,</w:t>
-      </w:r>
-      <w:r>
-        <w:rPr>
-          <w:sz w:val="24"/>
-          <w:szCs w:val="24"/>
-        </w:rPr>
-        <w:t xml:space="preserve"> </w:t>
-      </w:r>
-      <w:r>
-        <w:rPr>
-          <w:sz w:val="24"/>
-          <w:szCs w:val="24"/>
-        </w:rPr>
-        <w:t>para hacer lo que dije previamente, en este caso es la columna tipo</w:t>
+        <w:rPr>
+          <w:b/>
+          <w:bCs/>
+          <w:i/>
+          <w:iCs/>
+          <w:sz w:val="28"/>
+          <w:szCs w:val="28"/>
+        </w:rPr>
+      </w:pPr>
+      <w:r>
+        <w:rPr>
+          <w:b/>
+          <w:bCs/>
+          <w:i/>
+          <w:iCs/>
+          <w:sz w:val="28"/>
+          <w:szCs w:val="28"/>
+        </w:rPr>
+        <w:t xml:space="preserve">11. Entre la nueva tabla </w:t>
+      </w:r>
+      <w:proofErr w:type="spellStart"/>
+      <w:r>
+        <w:rPr>
+          <w:b/>
+          <w:bCs/>
+          <w:i/>
+          <w:iCs/>
+          <w:sz w:val="28"/>
+          <w:szCs w:val="28"/>
+        </w:rPr>
+        <w:t>type_customers</w:t>
+      </w:r>
+      <w:proofErr w:type="spellEnd"/>
+      <w:r>
+        <w:rPr>
+          <w:b/>
+          <w:bCs/>
+          <w:i/>
+          <w:iCs/>
+          <w:sz w:val="28"/>
+          <w:szCs w:val="28"/>
+        </w:rPr>
+        <w:t xml:space="preserve"> y la tabla </w:t>
+      </w:r>
+      <w:proofErr w:type="spellStart"/>
+      <w:r>
+        <w:rPr>
+          <w:b/>
+          <w:bCs/>
+          <w:i/>
+          <w:iCs/>
+          <w:sz w:val="28"/>
+          <w:szCs w:val="28"/>
+        </w:rPr>
+        <w:t>customers</w:t>
+      </w:r>
+      <w:proofErr w:type="spellEnd"/>
+      <w:r>
+        <w:rPr>
+          <w:b/>
+          <w:bCs/>
+          <w:i/>
+          <w:iCs/>
+          <w:sz w:val="28"/>
+          <w:szCs w:val="28"/>
+        </w:rPr>
+        <w:t xml:space="preserve"> existe una relación de 1 a N de tal manera que los </w:t>
+      </w:r>
+      <w:proofErr w:type="spellStart"/>
+      <w:r>
+        <w:rPr>
+          <w:b/>
+          <w:bCs/>
+          <w:i/>
+          <w:iCs/>
+          <w:sz w:val="28"/>
+          <w:szCs w:val="28"/>
+        </w:rPr>
+        <w:t>customers</w:t>
+      </w:r>
+      <w:proofErr w:type="spellEnd"/>
+      <w:r>
+        <w:rPr>
+          <w:b/>
+          <w:bCs/>
+          <w:i/>
+          <w:iCs/>
+          <w:sz w:val="28"/>
+          <w:szCs w:val="28"/>
+        </w:rPr>
+        <w:t xml:space="preserve"> (clientes) pertenecen a un único </w:t>
+      </w:r>
+      <w:proofErr w:type="spellStart"/>
+      <w:r>
+        <w:rPr>
+          <w:b/>
+          <w:bCs/>
+          <w:i/>
+          <w:iCs/>
+          <w:sz w:val="28"/>
+          <w:szCs w:val="28"/>
+        </w:rPr>
+        <w:t>type_customers</w:t>
+      </w:r>
+      <w:proofErr w:type="spellEnd"/>
+      <w:r>
+        <w:rPr>
+          <w:b/>
+          <w:bCs/>
+          <w:i/>
+          <w:iCs/>
+          <w:sz w:val="28"/>
+          <w:szCs w:val="28"/>
+        </w:rPr>
+        <w:t xml:space="preserve"> (tipo de clientes) </w:t>
+      </w:r>
+      <w:r>
+        <w:rPr>
+          <w:b/>
+          <w:bCs/>
+          <w:i/>
+          <w:iCs/>
+          <w:sz w:val="28"/>
+          <w:szCs w:val="28"/>
+        </w:rPr>
+        <w:t xml:space="preserve">y </w:t>
+      </w:r>
+      <w:proofErr w:type="spellStart"/>
+      <w:r>
+        <w:rPr>
+          <w:b/>
+          <w:bCs/>
+          <w:i/>
+          <w:iCs/>
+          <w:sz w:val="28"/>
+          <w:szCs w:val="28"/>
+        </w:rPr>
+        <w:t>type</w:t>
+      </w:r>
+      <w:r>
+        <w:rPr>
+          <w:b/>
+          <w:bCs/>
+          <w:i/>
+          <w:iCs/>
+          <w:sz w:val="28"/>
+          <w:szCs w:val="28"/>
+        </w:rPr>
+        <w:t>_customers</w:t>
+      </w:r>
+      <w:proofErr w:type="spellEnd"/>
+      <w:r>
+        <w:rPr>
+          <w:b/>
+          <w:bCs/>
+          <w:i/>
+          <w:iCs/>
+          <w:sz w:val="28"/>
+          <w:szCs w:val="28"/>
+        </w:rPr>
+        <w:t xml:space="preserve"> tiene varios </w:t>
+      </w:r>
+      <w:proofErr w:type="spellStart"/>
+      <w:r>
+        <w:rPr>
+          <w:b/>
+          <w:bCs/>
+          <w:i/>
+          <w:iCs/>
+          <w:sz w:val="28"/>
+          <w:szCs w:val="28"/>
+        </w:rPr>
+        <w:t>customers</w:t>
+      </w:r>
+      <w:proofErr w:type="spellEnd"/>
+      <w:r>
+        <w:rPr>
+          <w:b/>
+          <w:bCs/>
+          <w:i/>
+          <w:iCs/>
+          <w:sz w:val="28"/>
+          <w:szCs w:val="28"/>
+        </w:rPr>
+        <w:t xml:space="preserve"> o clientes. ¿qué nueva tabla o relación hay que crear para relacionar las tablas </w:t>
+      </w:r>
+      <w:proofErr w:type="spellStart"/>
+      <w:r>
+        <w:rPr>
+          <w:b/>
+          <w:bCs/>
+          <w:i/>
+          <w:iCs/>
+          <w:sz w:val="28"/>
+          <w:szCs w:val="28"/>
+        </w:rPr>
+        <w:t>type_customers</w:t>
+      </w:r>
+      <w:proofErr w:type="spellEnd"/>
+      <w:r>
+        <w:rPr>
+          <w:b/>
+          <w:bCs/>
+          <w:i/>
+          <w:iCs/>
+          <w:sz w:val="28"/>
+          <w:szCs w:val="28"/>
+        </w:rPr>
+        <w:t xml:space="preserve"> con </w:t>
+      </w:r>
+      <w:proofErr w:type="spellStart"/>
+      <w:r>
+        <w:rPr>
+          <w:b/>
+          <w:bCs/>
+          <w:i/>
+          <w:iCs/>
+          <w:sz w:val="28"/>
+          <w:szCs w:val="28"/>
+        </w:rPr>
+        <w:t>customers</w:t>
+      </w:r>
+      <w:proofErr w:type="spellEnd"/>
+      <w:r>
+        <w:rPr>
+          <w:b/>
+          <w:bCs/>
+          <w:i/>
+          <w:iCs/>
+          <w:sz w:val="28"/>
+          <w:szCs w:val="28"/>
+        </w:rPr>
+        <w:t xml:space="preserve">. Escribe el comando para crearla. </w:t>
+      </w:r>
+    </w:p>
+    <w:p>
+      <w:pPr>
+        <w:rPr>
+          <w:sz w:val="24"/>
+          <w:szCs w:val="24"/>
+        </w:rPr>
+      </w:pPr>
+      <w:r>
+        <w:rPr>
+          <w:sz w:val="24"/>
+          <w:szCs w:val="24"/>
+        </w:rPr>
+        <w:t>Crearemos una nueva tabla cuyas columnas coincidan con los tipos de datos de las claves primarias de las tablas que vamos a enlazar.</w:t>
+      </w:r>
+    </w:p>
+    <w:p>
+      <w:pPr>
+        <w:rPr>
+          <w:sz w:val="24"/>
+          <w:szCs w:val="24"/>
+        </w:rPr>
+      </w:pPr>
+      <w:r>
+        <w:rPr>
+          <w:sz w:val="24"/>
+          <w:szCs w:val="24"/>
+        </w:rPr>
+        <w:lastRenderedPageBreak/>
+        <w:t xml:space="preserve">Pero antes de eso, asignaré una columna de la tabla </w:t>
+      </w:r>
+      <w:proofErr w:type="spellStart"/>
+      <w:r>
+        <w:rPr>
+          <w:sz w:val="24"/>
+          <w:szCs w:val="24"/>
+        </w:rPr>
+        <w:t>type_customers</w:t>
+      </w:r>
+      <w:proofErr w:type="spellEnd"/>
+      <w:r>
+        <w:rPr>
+          <w:sz w:val="24"/>
+          <w:szCs w:val="24"/>
+        </w:rPr>
+        <w:t xml:space="preserve"> como clave primaria para lo que mencioné anteriormente. En este caso, la columna que utilizaré como clave primaria será la columna tipo.</w:t>
       </w:r>
     </w:p>
     <w:p>
@@ -2104,14 +2986,6 @@
           <w:szCs w:val="24"/>
         </w:rPr>
       </w:pPr>
-    </w:p>
-    <w:p>
-      <w:pPr>
-        <w:rPr>
-          <w:sz w:val="24"/>
-          <w:szCs w:val="24"/>
-        </w:rPr>
-      </w:pPr>
       <w:r>
         <w:rPr>
           <w:noProof/>
@@ -2180,7 +3054,7 @@
           <w:sz w:val="24"/>
           <w:szCs w:val="24"/>
         </w:rPr>
-        <w:t xml:space="preserve">Como vemos, la primera parte es igual a crear una tabla normal, si nos damos cuenta los tipos de datos creados </w:t>
+        <w:t xml:space="preserve">La primera parte del proceso es similar a la creación de una tabla normal. En este caso, los tipos de datos </w:t>
       </w:r>
       <w:proofErr w:type="gramStart"/>
       <w:r>
@@ -2188,7 +3062,7 @@
           <w:sz w:val="24"/>
           <w:szCs w:val="24"/>
         </w:rPr>
-        <w:t>char(</w:t>
+        <w:t>CHAR(</w:t>
       </w:r>
       <w:proofErr w:type="gramEnd"/>
       <w:r>
@@ -2196,86 +3070,146 @@
           <w:sz w:val="24"/>
           <w:szCs w:val="24"/>
         </w:rPr>
-        <w:t xml:space="preserve">1) y int coinciden con los de los atributos de las 2 tablas que queremos mediante esta nueva tabla, la segunda parte es simplemente asignarles </w:t>
-      </w:r>
-      <w:r>
-        <w:rPr>
-          <w:sz w:val="24"/>
-          <w:szCs w:val="24"/>
-        </w:rPr>
-        <w:t>un rol de claves primarias a esos 2 atributos.</w:t>
-      </w:r>
-    </w:p>
-    <w:p>
-      <w:pPr>
-        <w:rPr>
-          <w:sz w:val="24"/>
-          <w:szCs w:val="24"/>
-        </w:rPr>
-      </w:pPr>
-      <w:r>
-        <w:rPr>
-          <w:sz w:val="24"/>
-          <w:szCs w:val="24"/>
-        </w:rPr>
-        <w:t>Y también hacemos una cosa muy curiosa, establecemos como claves extranjeras (recordemos, estas son claves que realmente son primarias en otras tablas y utilizamos para relacionar tablas y ahorrar recursos, de forma que hagamos diseños y a su vez programas, más eficientes), nuestras claves extranjeras serán las que tenemos en nuestra nueva tabla, que harán referencia respectivamente a las claves primarias de las tablas que queremos relacionar</w:t>
-      </w:r>
-    </w:p>
-    <w:p>
-      <w:pPr>
-        <w:pStyle w:val="ListParagraph"/>
-        <w:numPr>
-          <w:ilvl w:val="0"/>
-          <w:numId w:val="1"/>
-        </w:numPr>
-        <w:rPr>
-          <w:sz w:val="24"/>
-          <w:szCs w:val="24"/>
-        </w:rPr>
-      </w:pPr>
-      <w:r>
-        <w:rPr>
-          <w:sz w:val="24"/>
-          <w:szCs w:val="24"/>
-        </w:rPr>
-        <w:t>Ejercicio 12</w:t>
-      </w:r>
-    </w:p>
-    <w:p>
-      <w:pPr>
-        <w:rPr>
-          <w:sz w:val="24"/>
-          <w:szCs w:val="24"/>
-        </w:rPr>
-      </w:pPr>
-      <w:r>
-        <w:rPr>
-          <w:sz w:val="24"/>
-          <w:szCs w:val="24"/>
-        </w:rPr>
-        <w:t>Ahora crearemos nuevas tuplas en esa nueva tabla creada</w:t>
-      </w:r>
-      <w:r>
-        <w:rPr>
-          <w:sz w:val="24"/>
-          <w:szCs w:val="24"/>
-        </w:rPr>
-        <w:t>, como son claves primarias tienen que coincidir con los datos ya almacenados previamente en nuestras otras tablas</w:t>
-      </w:r>
-    </w:p>
-    <w:p>
-      <w:pPr>
-        <w:rPr>
-          <w:sz w:val="24"/>
-          <w:szCs w:val="24"/>
-        </w:rPr>
-      </w:pPr>
-      <w:r>
-        <w:rPr>
-          <w:sz w:val="24"/>
-          <w:szCs w:val="24"/>
-        </w:rPr>
-        <w:t>Para que se me entienda</w:t>
+        <w:t>1) e INT definidos coinciden con los de los atributos de las dos tablas que queremos enlazar mediante esta nueva tabla. La segunda parte consiste en asignar el rol de claves primarias a estos dos atributos.</w:t>
+      </w:r>
+    </w:p>
+    <w:p>
+      <w:pPr>
+        <w:rPr>
+          <w:sz w:val="24"/>
+          <w:szCs w:val="24"/>
+        </w:rPr>
+      </w:pPr>
+      <w:r>
+        <w:rPr>
+          <w:sz w:val="24"/>
+          <w:szCs w:val="24"/>
+        </w:rPr>
+        <w:t xml:space="preserve">Luego, hacemos algo importante: establecemos </w:t>
+      </w:r>
+      <w:r>
+        <w:rPr>
+          <w:b/>
+          <w:bCs/>
+          <w:sz w:val="24"/>
+          <w:szCs w:val="24"/>
+        </w:rPr>
+        <w:t>claves externas</w:t>
+      </w:r>
+      <w:r>
+        <w:rPr>
+          <w:sz w:val="24"/>
+          <w:szCs w:val="24"/>
+        </w:rPr>
+        <w:t>. Las claves externas son claves que, aunque son primarias en otras tablas, las utilizamos para establecer relaciones entre tablas, lo que nos ayuda a ahorrar recursos y crear diseños y programas más eficientes. En nuestra nueva tabla, las claves externas harán referencia a las claves primarias de las tablas que deseamos relacionar.</w:t>
+      </w:r>
+    </w:p>
+    <w:p>
+      <w:pPr>
+        <w:rPr>
+          <w:b/>
+          <w:bCs/>
+          <w:i/>
+          <w:iCs/>
+          <w:sz w:val="28"/>
+          <w:szCs w:val="28"/>
+        </w:rPr>
+      </w:pPr>
+      <w:r>
+        <w:rPr>
+          <w:b/>
+          <w:bCs/>
+          <w:i/>
+          <w:iCs/>
+          <w:sz w:val="28"/>
+          <w:szCs w:val="28"/>
+        </w:rPr>
+        <w:t xml:space="preserve">12. Crea varias tuplas en la nueva tabla que relaciona </w:t>
+      </w:r>
+      <w:proofErr w:type="spellStart"/>
+      <w:r>
+        <w:rPr>
+          <w:b/>
+          <w:bCs/>
+          <w:i/>
+          <w:iCs/>
+          <w:sz w:val="28"/>
+          <w:szCs w:val="28"/>
+        </w:rPr>
+        <w:t>type_customers</w:t>
+      </w:r>
+      <w:proofErr w:type="spellEnd"/>
+      <w:r>
+        <w:rPr>
+          <w:b/>
+          <w:bCs/>
+          <w:i/>
+          <w:iCs/>
+          <w:sz w:val="28"/>
+          <w:szCs w:val="28"/>
+        </w:rPr>
+        <w:t xml:space="preserve">, con </w:t>
+      </w:r>
+      <w:proofErr w:type="spellStart"/>
+      <w:r>
+        <w:rPr>
+          <w:b/>
+          <w:bCs/>
+          <w:i/>
+          <w:iCs/>
+          <w:sz w:val="28"/>
+          <w:szCs w:val="28"/>
+        </w:rPr>
+        <w:t>customers</w:t>
+      </w:r>
+      <w:proofErr w:type="spellEnd"/>
+      <w:r>
+        <w:rPr>
+          <w:b/>
+          <w:bCs/>
+          <w:i/>
+          <w:iCs/>
+          <w:sz w:val="28"/>
+          <w:szCs w:val="28"/>
+        </w:rPr>
+        <w:t>.</w:t>
+      </w:r>
+    </w:p>
+    <w:p>
+      <w:pPr>
+        <w:rPr>
+          <w:sz w:val="24"/>
+          <w:szCs w:val="24"/>
+        </w:rPr>
+      </w:pPr>
+      <w:r>
+        <w:rPr>
+          <w:sz w:val="24"/>
+          <w:szCs w:val="24"/>
+        </w:rPr>
+        <w:t>Ahora vamos a insertar nuevas tuplas en la tabla recién creada. Dado que estas tuplas son claves primarias, los valores que asignemos deben coincidir con los datos que ya están almacenados en las tablas relacionadas.</w:t>
+      </w:r>
+      <w:r>
+        <w:rPr>
+          <w:sz w:val="24"/>
+          <w:szCs w:val="24"/>
+        </w:rPr>
+        <w:t xml:space="preserve"> </w:t>
+      </w:r>
+    </w:p>
+    <w:p>
+      <w:pPr>
+        <w:rPr>
+          <w:sz w:val="24"/>
+          <w:szCs w:val="24"/>
+        </w:rPr>
+      </w:pPr>
+      <w:r>
+        <w:rPr>
+          <w:sz w:val="24"/>
+          <w:szCs w:val="24"/>
+        </w:rPr>
+        <w:t>Para que sea comprensible.</w:t>
       </w:r>
     </w:p>
     <w:p>
@@ -2291,7 +3225,6 @@
           <w:sz w:val="24"/>
           <w:szCs w:val="24"/>
         </w:rPr>
-        <w:lastRenderedPageBreak/>
         <w:drawing>
           <wp:inline distT="0" distB="0" distL="0" distR="0" wp14:anchorId="3EF748D3" wp14:editId="040793AB">
             <wp:extent cx="2567940" cy="1402080"/>
@@ -2354,21 +3287,7 @@
           <w:sz w:val="24"/>
           <w:szCs w:val="24"/>
         </w:rPr>
-        <w:t>Al crear nuevas tuplas en nuestra nueva tabla, los tipos no pueden ser distintos a los que tenemos ahí</w:t>
-      </w:r>
-      <w:r>
-        <w:rPr>
-          <w:sz w:val="24"/>
-          <w:szCs w:val="24"/>
-        </w:rPr>
-        <w:t xml:space="preserve"> (en este caso los valores de la columna tipo)</w:t>
-      </w:r>
-      <w:r>
-        <w:rPr>
-          <w:sz w:val="24"/>
-          <w:szCs w:val="24"/>
-        </w:rPr>
-        <w:t>, veámoslo con esa creación de tuplas</w:t>
+        <w:t>Al crear nuevas tuplas en nuestra nueva tabla, los valores no pueden ser distintos a los que ya existen en las columnas correspondientes (en este caso, los valores de la columna tipo). Veámoslo con la creación de estas tuplas.</w:t>
       </w:r>
     </w:p>
     <w:p>
@@ -2384,6 +3303,7 @@
           <w:sz w:val="24"/>
           <w:szCs w:val="24"/>
         </w:rPr>
+        <w:lastRenderedPageBreak/>
         <w:drawing>
           <wp:inline distT="0" distB="0" distL="0" distR="0" wp14:anchorId="4365A577" wp14:editId="16DF34E0">
             <wp:extent cx="4137660" cy="2301240"/>
@@ -2453,93 +3373,218 @@
           <w:sz w:val="24"/>
           <w:szCs w:val="24"/>
         </w:rPr>
-        <w:t xml:space="preserve">Como vemos, usamos X e Y, y en customerNumber usamos valores ya asignados en esas tuplas que </w:t>
-      </w:r>
-      <w:r>
-        <w:rPr>
-          <w:sz w:val="24"/>
-          <w:szCs w:val="24"/>
-        </w:rPr>
-        <w:t xml:space="preserve">ya </w:t>
-      </w:r>
-      <w:r>
-        <w:rPr>
-          <w:sz w:val="24"/>
-          <w:szCs w:val="24"/>
-        </w:rPr>
-        <w:t>tiene customer</w:t>
-      </w:r>
-      <w:r>
-        <w:rPr>
-          <w:sz w:val="24"/>
-          <w:szCs w:val="24"/>
-        </w:rPr>
-        <w:t xml:space="preserve"> </w:t>
-      </w:r>
-      <w:r>
-        <w:rPr>
-          <w:sz w:val="24"/>
-          <w:szCs w:val="24"/>
-        </w:rPr>
-        <w:t>(podemos</w:t>
-      </w:r>
-      <w:r>
-        <w:rPr>
-          <w:sz w:val="24"/>
-          <w:szCs w:val="24"/>
-        </w:rPr>
-        <w:t xml:space="preserve"> ver cuáles son los valores que podríamos utilizar haciendo un select customerNumber from </w:t>
-      </w:r>
-      <w:proofErr w:type="gramStart"/>
-      <w:r>
-        <w:rPr>
-          <w:sz w:val="24"/>
-          <w:szCs w:val="24"/>
-        </w:rPr>
-        <w:t>customers ;</w:t>
-      </w:r>
-      <w:proofErr w:type="gramEnd"/>
-      <w:r>
-        <w:rPr>
-          <w:sz w:val="24"/>
-          <w:szCs w:val="24"/>
-        </w:rPr>
-        <w:t xml:space="preserve"> ) </w:t>
-      </w:r>
-    </w:p>
-    <w:p>
-      <w:pPr>
-        <w:pStyle w:val="ListParagraph"/>
-        <w:numPr>
-          <w:ilvl w:val="0"/>
-          <w:numId w:val="1"/>
-        </w:numPr>
-        <w:rPr>
-          <w:sz w:val="24"/>
-          <w:szCs w:val="24"/>
-        </w:rPr>
-      </w:pPr>
-      <w:r>
-        <w:rPr>
-          <w:sz w:val="24"/>
-          <w:szCs w:val="24"/>
-        </w:rPr>
-        <w:t>Ejercicio 13</w:t>
-      </w:r>
-    </w:p>
-    <w:p>
-      <w:pPr>
-        <w:rPr>
-          <w:sz w:val="24"/>
-          <w:szCs w:val="24"/>
-        </w:rPr>
-      </w:pPr>
-      <w:r>
-        <w:rPr>
-          <w:sz w:val="24"/>
-          <w:szCs w:val="24"/>
-        </w:rPr>
-        <w:t>Y como vemos nos sale de manera correcta</w:t>
+        <w:t xml:space="preserve">Como podemos ver, utilizamos los valores </w:t>
+      </w:r>
+      <w:r>
+        <w:rPr>
+          <w:b/>
+          <w:bCs/>
+          <w:sz w:val="24"/>
+          <w:szCs w:val="24"/>
+        </w:rPr>
+        <w:t>X</w:t>
+      </w:r>
+      <w:r>
+        <w:rPr>
+          <w:sz w:val="24"/>
+          <w:szCs w:val="24"/>
+        </w:rPr>
+        <w:t xml:space="preserve"> e </w:t>
+      </w:r>
+      <w:r>
+        <w:rPr>
+          <w:b/>
+          <w:bCs/>
+          <w:sz w:val="24"/>
+          <w:szCs w:val="24"/>
+        </w:rPr>
+        <w:t>Y</w:t>
+      </w:r>
+      <w:r>
+        <w:rPr>
+          <w:sz w:val="24"/>
+          <w:szCs w:val="24"/>
+        </w:rPr>
+        <w:t xml:space="preserve">, y en la columna </w:t>
+      </w:r>
+      <w:proofErr w:type="spellStart"/>
+      <w:r>
+        <w:rPr>
+          <w:sz w:val="24"/>
+          <w:szCs w:val="24"/>
+        </w:rPr>
+        <w:t>customerNumber</w:t>
+      </w:r>
+      <w:proofErr w:type="spellEnd"/>
+      <w:r>
+        <w:rPr>
+          <w:sz w:val="24"/>
+          <w:szCs w:val="24"/>
+        </w:rPr>
+        <w:t xml:space="preserve"> asignamos valores que ya están presentes en la tabla </w:t>
+      </w:r>
+      <w:proofErr w:type="spellStart"/>
+      <w:r>
+        <w:rPr>
+          <w:sz w:val="24"/>
+          <w:szCs w:val="24"/>
+        </w:rPr>
+        <w:t>customers</w:t>
+      </w:r>
+      <w:proofErr w:type="spellEnd"/>
+      <w:r>
+        <w:rPr>
+          <w:sz w:val="24"/>
+          <w:szCs w:val="24"/>
+        </w:rPr>
+        <w:t>. Pod</w:t>
+      </w:r>
+      <w:r>
+        <w:rPr>
+          <w:sz w:val="24"/>
+          <w:szCs w:val="24"/>
+        </w:rPr>
+        <w:t xml:space="preserve">ríamos </w:t>
+      </w:r>
+      <w:r>
+        <w:rPr>
+          <w:sz w:val="24"/>
+          <w:szCs w:val="24"/>
+        </w:rPr>
+        <w:t>ver cuáles son los valores disponibles para usar ejecutando la consulta:</w:t>
+      </w:r>
+    </w:p>
+    <w:p>
+      <w:pPr>
+        <w:rPr>
+          <w:sz w:val="24"/>
+          <w:szCs w:val="24"/>
+        </w:rPr>
+      </w:pPr>
+      <w:r>
+        <w:rPr>
+          <w:sz w:val="24"/>
+          <w:szCs w:val="24"/>
+        </w:rPr>
+        <w:t xml:space="preserve">SELECT </w:t>
+      </w:r>
+      <w:proofErr w:type="spellStart"/>
+      <w:r>
+        <w:rPr>
+          <w:sz w:val="24"/>
+          <w:szCs w:val="24"/>
+        </w:rPr>
+        <w:t>customerNumber</w:t>
+      </w:r>
+      <w:proofErr w:type="spellEnd"/>
+      <w:r>
+        <w:rPr>
+          <w:sz w:val="24"/>
+          <w:szCs w:val="24"/>
+        </w:rPr>
+        <w:t xml:space="preserve"> FROM </w:t>
+      </w:r>
+      <w:proofErr w:type="spellStart"/>
+      <w:r>
+        <w:rPr>
+          <w:sz w:val="24"/>
+          <w:szCs w:val="24"/>
+        </w:rPr>
+        <w:t>customers</w:t>
+      </w:r>
+      <w:proofErr w:type="spellEnd"/>
+      <w:r>
+        <w:rPr>
+          <w:sz w:val="24"/>
+          <w:szCs w:val="24"/>
+        </w:rPr>
+        <w:t>;</w:t>
+      </w:r>
+    </w:p>
+    <w:p>
+      <w:pPr>
+        <w:rPr>
+          <w:b/>
+          <w:bCs/>
+          <w:i/>
+          <w:iCs/>
+          <w:sz w:val="28"/>
+          <w:szCs w:val="28"/>
+        </w:rPr>
+      </w:pPr>
+      <w:r>
+        <w:rPr>
+          <w:b/>
+          <w:bCs/>
+          <w:i/>
+          <w:iCs/>
+          <w:sz w:val="28"/>
+          <w:szCs w:val="28"/>
+        </w:rPr>
+        <w:t xml:space="preserve">13. Modifica el diagrama entidad relación para incorporar las dos nuevas tablas creadas y la tabla que relaciona </w:t>
+      </w:r>
+      <w:proofErr w:type="spellStart"/>
+      <w:r>
+        <w:rPr>
+          <w:b/>
+          <w:bCs/>
+          <w:i/>
+          <w:iCs/>
+          <w:sz w:val="28"/>
+          <w:szCs w:val="28"/>
+        </w:rPr>
+        <w:t>type_customers</w:t>
+      </w:r>
+      <w:proofErr w:type="spellEnd"/>
+      <w:r>
+        <w:rPr>
+          <w:b/>
+          <w:bCs/>
+          <w:i/>
+          <w:iCs/>
+          <w:sz w:val="28"/>
+          <w:szCs w:val="28"/>
+        </w:rPr>
+        <w:t xml:space="preserve"> con </w:t>
+      </w:r>
+      <w:proofErr w:type="spellStart"/>
+      <w:r>
+        <w:rPr>
+          <w:b/>
+          <w:bCs/>
+          <w:i/>
+          <w:iCs/>
+          <w:sz w:val="28"/>
+          <w:szCs w:val="28"/>
+        </w:rPr>
+        <w:t>customers</w:t>
+      </w:r>
+      <w:proofErr w:type="spellEnd"/>
+      <w:r>
+        <w:rPr>
+          <w:b/>
+          <w:bCs/>
+          <w:i/>
+          <w:iCs/>
+          <w:sz w:val="28"/>
+          <w:szCs w:val="28"/>
+        </w:rPr>
+        <w:t>.</w:t>
+      </w:r>
+    </w:p>
+    <w:p>
+      <w:pPr>
+        <w:rPr>
+          <w:sz w:val="24"/>
+          <w:szCs w:val="24"/>
+        </w:rPr>
+      </w:pPr>
+      <w:r>
+        <w:rPr>
+          <w:sz w:val="24"/>
+          <w:szCs w:val="24"/>
+        </w:rPr>
+        <w:t>Como podemos ver, los resultados se muestran correctamente.</w:t>
       </w:r>
     </w:p>
     <w:p>
@@ -2606,65 +3651,160 @@
     </w:p>
     <w:p>
       <w:pPr>
-        <w:pStyle w:val="ListParagraph"/>
-        <w:numPr>
-          <w:ilvl w:val="0"/>
-          <w:numId w:val="1"/>
-        </w:numPr>
-        <w:rPr>
-          <w:sz w:val="24"/>
-          <w:szCs w:val="24"/>
-        </w:rPr>
-      </w:pPr>
-      <w:r>
-        <w:rPr>
-          <w:sz w:val="24"/>
-          <w:szCs w:val="24"/>
-        </w:rPr>
-        <w:t>Ejercicio 14</w:t>
-      </w:r>
-    </w:p>
-    <w:p>
-      <w:pPr>
-        <w:rPr>
-          <w:sz w:val="24"/>
-          <w:szCs w:val="24"/>
-        </w:rPr>
-      </w:pPr>
-      <w:r>
-        <w:rPr>
-          <w:sz w:val="24"/>
-          <w:szCs w:val="24"/>
-        </w:rPr>
-        <w:t>Ahora vamos a borrar las nuevas tablas que hemos creado en esta práctica (</w:t>
-      </w:r>
-      <w:r>
-        <w:rPr>
-          <w:sz w:val="24"/>
-          <w:szCs w:val="24"/>
-        </w:rPr>
-        <w:t>cus</w:t>
-      </w:r>
-      <w:r>
-        <w:rPr>
-          <w:sz w:val="24"/>
-          <w:szCs w:val="24"/>
-        </w:rPr>
-        <w:t>t</w:t>
-      </w:r>
-      <w:r>
-        <w:rPr>
-          <w:sz w:val="24"/>
-          <w:szCs w:val="24"/>
-        </w:rPr>
-        <w:t>omer_t</w:t>
-      </w:r>
-      <w:r>
-        <w:rPr>
-          <w:sz w:val="24"/>
-          <w:szCs w:val="24"/>
-        </w:rPr>
-        <w:t>ype_customers y type_customers), eso lo haremos con un drop table nombre_de_la_tabla</w:t>
+        <w:rPr>
+          <w:b/>
+          <w:bCs/>
+          <w:i/>
+          <w:iCs/>
+          <w:sz w:val="28"/>
+          <w:szCs w:val="28"/>
+        </w:rPr>
+      </w:pPr>
+      <w:r>
+        <w:rPr>
+          <w:b/>
+          <w:bCs/>
+          <w:i/>
+          <w:iCs/>
+          <w:sz w:val="28"/>
+          <w:szCs w:val="28"/>
+        </w:rPr>
+        <w:t xml:space="preserve">14. Borra las nuevas tablas creadas </w:t>
+      </w:r>
+      <w:proofErr w:type="spellStart"/>
+      <w:r>
+        <w:rPr>
+          <w:b/>
+          <w:bCs/>
+          <w:i/>
+          <w:iCs/>
+          <w:sz w:val="28"/>
+          <w:szCs w:val="28"/>
+        </w:rPr>
+        <w:t>type_customers</w:t>
+      </w:r>
+      <w:proofErr w:type="spellEnd"/>
+      <w:r>
+        <w:rPr>
+          <w:b/>
+          <w:bCs/>
+          <w:i/>
+          <w:iCs/>
+          <w:sz w:val="28"/>
+          <w:szCs w:val="28"/>
+        </w:rPr>
+        <w:t xml:space="preserve"> y la tabla que relaciona </w:t>
+      </w:r>
+      <w:proofErr w:type="spellStart"/>
+      <w:r>
+        <w:rPr>
+          <w:b/>
+          <w:bCs/>
+          <w:i/>
+          <w:iCs/>
+          <w:sz w:val="28"/>
+          <w:szCs w:val="28"/>
+        </w:rPr>
+        <w:t>type_customers</w:t>
+      </w:r>
+      <w:proofErr w:type="spellEnd"/>
+      <w:r>
+        <w:rPr>
+          <w:b/>
+          <w:bCs/>
+          <w:i/>
+          <w:iCs/>
+          <w:sz w:val="28"/>
+          <w:szCs w:val="28"/>
+        </w:rPr>
+        <w:t xml:space="preserve"> con </w:t>
+      </w:r>
+      <w:proofErr w:type="spellStart"/>
+      <w:r>
+        <w:rPr>
+          <w:b/>
+          <w:bCs/>
+          <w:i/>
+          <w:iCs/>
+          <w:sz w:val="28"/>
+          <w:szCs w:val="28"/>
+        </w:rPr>
+        <w:t>customers</w:t>
+      </w:r>
+      <w:proofErr w:type="spellEnd"/>
+      <w:r>
+        <w:rPr>
+          <w:b/>
+          <w:bCs/>
+          <w:i/>
+          <w:iCs/>
+          <w:sz w:val="28"/>
+          <w:szCs w:val="28"/>
+        </w:rPr>
+        <w:t>.</w:t>
+      </w:r>
+    </w:p>
+    <w:p>
+      <w:pPr>
+        <w:rPr>
+          <w:sz w:val="24"/>
+          <w:szCs w:val="24"/>
+        </w:rPr>
+      </w:pPr>
+      <w:r>
+        <w:rPr>
+          <w:sz w:val="24"/>
+          <w:szCs w:val="24"/>
+        </w:rPr>
+        <w:t>Ahora vamos a eliminar las tablas que hemos creado en esta práctica (</w:t>
+      </w:r>
+      <w:proofErr w:type="spellStart"/>
+      <w:r>
+        <w:rPr>
+          <w:sz w:val="24"/>
+          <w:szCs w:val="24"/>
+        </w:rPr>
+        <w:t>customer_type_customers</w:t>
+      </w:r>
+      <w:proofErr w:type="spellEnd"/>
+      <w:r>
+        <w:rPr>
+          <w:sz w:val="24"/>
+          <w:szCs w:val="24"/>
+        </w:rPr>
+        <w:t xml:space="preserve"> y </w:t>
+      </w:r>
+      <w:proofErr w:type="spellStart"/>
+      <w:r>
+        <w:rPr>
+          <w:sz w:val="24"/>
+          <w:szCs w:val="24"/>
+        </w:rPr>
+        <w:t>type_customers</w:t>
+      </w:r>
+      <w:proofErr w:type="spellEnd"/>
+      <w:r>
+        <w:rPr>
+          <w:sz w:val="24"/>
+          <w:szCs w:val="24"/>
+        </w:rPr>
+        <w:t xml:space="preserve">). Para hacerlo, utilizaremos el comando DROP TABLE </w:t>
+      </w:r>
+      <w:proofErr w:type="spellStart"/>
+      <w:r>
+        <w:rPr>
+          <w:sz w:val="24"/>
+          <w:szCs w:val="24"/>
+        </w:rPr>
+        <w:t>nombre_de_la_tabla</w:t>
+      </w:r>
+      <w:proofErr w:type="spellEnd"/>
+      <w:r>
+        <w:rPr>
+          <w:sz w:val="24"/>
+          <w:szCs w:val="24"/>
+        </w:rPr>
+        <w:t>.</w:t>
       </w:r>
     </w:p>
     <w:p>
@@ -2742,16 +3882,8 @@
           <w:sz w:val="24"/>
           <w:szCs w:val="24"/>
         </w:rPr>
-        <w:t>Ya estarían las 2 tablas borradas</w:t>
-      </w:r>
-    </w:p>
-    <w:p>
-      <w:pPr>
-        <w:rPr>
-          <w:sz w:val="24"/>
-          <w:szCs w:val="24"/>
-        </w:rPr>
-      </w:pPr>
+        <w:t>Y con eso, las dos tablas ya estarían borradas.</w:t>
+      </w:r>
     </w:p>
     <w:p>
       <w:pPr>
@@ -2871,48 +4003,150 @@
           <w:sz w:val="24"/>
           <w:szCs w:val="24"/>
         </w:rPr>
-        <w:t xml:space="preserve">En este ejercicio, utilizamos el comando </w:t>
-      </w:r>
-      <w:r>
-        <w:rPr>
-          <w:b/>
-          <w:bCs/>
-          <w:i/>
-          <w:iCs/>
-          <w:sz w:val="24"/>
-          <w:szCs w:val="24"/>
-        </w:rPr>
-        <w:t xml:space="preserve">create database </w:t>
-      </w:r>
-      <w:r>
-        <w:rPr>
-          <w:sz w:val="24"/>
-          <w:szCs w:val="24"/>
-        </w:rPr>
-        <w:t>para crear la base de datos banco y poder operar en ella.</w:t>
-      </w:r>
-    </w:p>
-    <w:p>
-      <w:pPr>
-        <w:rPr>
-          <w:b/>
-          <w:bCs/>
-          <w:i/>
-          <w:iCs/>
-          <w:sz w:val="28"/>
-          <w:szCs w:val="28"/>
-        </w:rPr>
-      </w:pPr>
-      <w:r>
-        <w:rPr>
-          <w:b/>
-          <w:bCs/>
-          <w:i/>
-          <w:iCs/>
-          <w:sz w:val="28"/>
-          <w:szCs w:val="28"/>
-        </w:rPr>
-        <w:t>2. En esa base de datos, crea todas las tablas o relaciones del modelo relacional visto en clase. Cuando crees estas tablas, tienes que definir para todas una clave primaria; si tiene clave extranjera o foránea, tienes que indicarla también; tienes que indicar cuáles deben de tener valores no nulos; cualquier otra restricción respecto a los valores de los atributos también tiene que ser indicada. Por ejemplo, la tabla sucursal_cuenta debe tener los atributos numero_cuenta y nombre_sucursal, indicando también que numero_cuenta es clave primaria, no admite valores nulos, y que nombre_sucursal es una clave foránea extraída de la tabla sucursal.</w:t>
+        <w:t>En este ejercicio, utilizamos el comando CREATE DATABASE para crear la base de datos banco y poder trabajar en ella.</w:t>
+      </w:r>
+    </w:p>
+    <w:p>
+      <w:pPr>
+        <w:rPr>
+          <w:b/>
+          <w:bCs/>
+          <w:i/>
+          <w:iCs/>
+          <w:sz w:val="28"/>
+          <w:szCs w:val="28"/>
+        </w:rPr>
+      </w:pPr>
+      <w:r>
+        <w:rPr>
+          <w:b/>
+          <w:bCs/>
+          <w:i/>
+          <w:iCs/>
+          <w:sz w:val="28"/>
+          <w:szCs w:val="28"/>
+        </w:rPr>
+        <w:t xml:space="preserve">2. En esa base de datos, crea todas las tablas o relaciones del modelo relacional visto en clase. Cuando crees estas tablas, tienes que definir para todas una clave primaria; si tiene clave extranjera o foránea, tienes que indicarla también; tienes que indicar cuáles deben de tener valores no nulos; cualquier otra restricción respecto a los valores de los atributos también tiene que ser indicada. Por ejemplo, la tabla </w:t>
+      </w:r>
+      <w:proofErr w:type="spellStart"/>
+      <w:r>
+        <w:rPr>
+          <w:b/>
+          <w:bCs/>
+          <w:i/>
+          <w:iCs/>
+          <w:sz w:val="28"/>
+          <w:szCs w:val="28"/>
+        </w:rPr>
+        <w:t>sucursal_cuenta</w:t>
+      </w:r>
+      <w:proofErr w:type="spellEnd"/>
+      <w:r>
+        <w:rPr>
+          <w:b/>
+          <w:bCs/>
+          <w:i/>
+          <w:iCs/>
+          <w:sz w:val="28"/>
+          <w:szCs w:val="28"/>
+        </w:rPr>
+        <w:t xml:space="preserve"> debe tener los atributos </w:t>
+      </w:r>
+      <w:proofErr w:type="spellStart"/>
+      <w:r>
+        <w:rPr>
+          <w:b/>
+          <w:bCs/>
+          <w:i/>
+          <w:iCs/>
+          <w:sz w:val="28"/>
+          <w:szCs w:val="28"/>
+        </w:rPr>
+        <w:t>numero_cuenta</w:t>
+      </w:r>
+      <w:proofErr w:type="spellEnd"/>
+      <w:r>
+        <w:rPr>
+          <w:b/>
+          <w:bCs/>
+          <w:i/>
+          <w:iCs/>
+          <w:sz w:val="28"/>
+          <w:szCs w:val="28"/>
+        </w:rPr>
+        <w:t xml:space="preserve"> y </w:t>
+      </w:r>
+      <w:proofErr w:type="spellStart"/>
+      <w:r>
+        <w:rPr>
+          <w:b/>
+          <w:bCs/>
+          <w:i/>
+          <w:iCs/>
+          <w:sz w:val="28"/>
+          <w:szCs w:val="28"/>
+        </w:rPr>
+        <w:t>nombre_sucursal</w:t>
+      </w:r>
+      <w:proofErr w:type="spellEnd"/>
+      <w:r>
+        <w:rPr>
+          <w:b/>
+          <w:bCs/>
+          <w:i/>
+          <w:iCs/>
+          <w:sz w:val="28"/>
+          <w:szCs w:val="28"/>
+        </w:rPr>
+        <w:t xml:space="preserve">, indicando también que </w:t>
+      </w:r>
+      <w:proofErr w:type="spellStart"/>
+      <w:r>
+        <w:rPr>
+          <w:b/>
+          <w:bCs/>
+          <w:i/>
+          <w:iCs/>
+          <w:sz w:val="28"/>
+          <w:szCs w:val="28"/>
+        </w:rPr>
+        <w:t>numero_cuenta</w:t>
+      </w:r>
+      <w:proofErr w:type="spellEnd"/>
+      <w:r>
+        <w:rPr>
+          <w:b/>
+          <w:bCs/>
+          <w:i/>
+          <w:iCs/>
+          <w:sz w:val="28"/>
+          <w:szCs w:val="28"/>
+        </w:rPr>
+        <w:t xml:space="preserve"> es clave primaria, no admite valores nulos, y que </w:t>
+      </w:r>
+      <w:proofErr w:type="spellStart"/>
+      <w:r>
+        <w:rPr>
+          <w:b/>
+          <w:bCs/>
+          <w:i/>
+          <w:iCs/>
+          <w:sz w:val="28"/>
+          <w:szCs w:val="28"/>
+        </w:rPr>
+        <w:t>nombre_sucursal</w:t>
+      </w:r>
+      <w:proofErr w:type="spellEnd"/>
+      <w:r>
+        <w:rPr>
+          <w:b/>
+          <w:bCs/>
+          <w:i/>
+          <w:iCs/>
+          <w:sz w:val="28"/>
+          <w:szCs w:val="28"/>
+        </w:rPr>
+        <w:t xml:space="preserve"> es una clave foránea extraída de la tabla sucursal.</w:t>
       </w:r>
     </w:p>
     <w:p>
@@ -3250,16 +4484,29 @@
         </w:rPr>
         <w:t xml:space="preserve">Las dos imágenes anteriores muestran las tablas de las relaciones </w:t>
       </w:r>
-      <w:r>
-        <w:rPr>
-          <w:b/>
-          <w:bCs/>
-          <w:i/>
-          <w:iCs/>
-          <w:sz w:val="24"/>
-          <w:szCs w:val="24"/>
-        </w:rPr>
-        <w:t xml:space="preserve">sucursal_cuenta </w:t>
+      <w:proofErr w:type="spellStart"/>
+      <w:r>
+        <w:rPr>
+          <w:b/>
+          <w:bCs/>
+          <w:i/>
+          <w:iCs/>
+          <w:sz w:val="24"/>
+          <w:szCs w:val="24"/>
+        </w:rPr>
+        <w:t>sucursal_cuenta</w:t>
+      </w:r>
+      <w:proofErr w:type="spellEnd"/>
+      <w:r>
+        <w:rPr>
+          <w:b/>
+          <w:bCs/>
+          <w:i/>
+          <w:iCs/>
+          <w:sz w:val="24"/>
+          <w:szCs w:val="24"/>
+        </w:rPr>
+        <w:t xml:space="preserve"> </w:t>
       </w:r>
       <w:r>
         <w:rPr>
@@ -3268,6 +4515,7 @@
         </w:rPr>
         <w:t xml:space="preserve">y </w:t>
       </w:r>
+      <w:proofErr w:type="spellStart"/>
       <w:r>
         <w:rPr>
           <w:b/>
@@ -3279,12 +4527,45 @@
         </w:rPr>
         <w:t>sucursal_prestamo</w:t>
       </w:r>
-      <w:r>
-        <w:rPr>
-          <w:sz w:val="24"/>
-          <w:szCs w:val="24"/>
-        </w:rPr>
-        <w:t>. En la tabla sucursal_cuenta, por ejemplo, definimos numero_cuenta como clave primaria y como atributo que no admite valores nulos tal y como se especifica en el enunciado. Definimos también los correspondientes atributos como claves foráneas que apuntan/referencian a las tablas correspondientes.</w:t>
+      <w:proofErr w:type="spellEnd"/>
+      <w:r>
+        <w:rPr>
+          <w:sz w:val="24"/>
+          <w:szCs w:val="24"/>
+        </w:rPr>
+        <w:t xml:space="preserve">. En la tabla </w:t>
+      </w:r>
+      <w:proofErr w:type="spellStart"/>
+      <w:r>
+        <w:rPr>
+          <w:sz w:val="24"/>
+          <w:szCs w:val="24"/>
+        </w:rPr>
+        <w:t>sucursal_cuenta</w:t>
+      </w:r>
+      <w:proofErr w:type="spellEnd"/>
+      <w:r>
+        <w:rPr>
+          <w:sz w:val="24"/>
+          <w:szCs w:val="24"/>
+        </w:rPr>
+        <w:t xml:space="preserve">, por ejemplo, definimos </w:t>
+      </w:r>
+      <w:proofErr w:type="spellStart"/>
+      <w:r>
+        <w:rPr>
+          <w:sz w:val="24"/>
+          <w:szCs w:val="24"/>
+        </w:rPr>
+        <w:t>numero_cuenta</w:t>
+      </w:r>
+      <w:proofErr w:type="spellEnd"/>
+      <w:r>
+        <w:rPr>
+          <w:sz w:val="24"/>
+          <w:szCs w:val="24"/>
+        </w:rPr>
+        <w:t xml:space="preserve"> como clave primaria y como atributo que no admite valores nulos tal y como se especifica en el enunciado. Definimos también los correspondientes atributos como claves foráneas que apuntan/referencian a las tablas correspondientes.</w:t>
       </w:r>
     </w:p>
     <w:p>
@@ -3374,18 +4655,47 @@
           <w:sz w:val="24"/>
           <w:szCs w:val="24"/>
         </w:rPr>
-        <w:t xml:space="preserve">, se genera la tabla que muestra la imagen anterior. Como se aprecia en el código, vemos que la clave primaria esta compuesta por dos atributos al contrario que en las dos anteriores relaciones. Y por último vemos que el atributo </w:t>
-      </w:r>
-      <w:r>
-        <w:rPr>
-          <w:b/>
-          <w:bCs/>
-          <w:i/>
-          <w:iCs/>
-          <w:sz w:val="24"/>
-          <w:szCs w:val="24"/>
-        </w:rPr>
-        <w:t xml:space="preserve">fecha_acceso </w:t>
+        <w:t xml:space="preserve">, se genera la tabla que muestra la imagen anterior. Como se aprecia en el código, vemos que la clave primaria </w:t>
+      </w:r>
+      <w:proofErr w:type="spellStart"/>
+      <w:r>
+        <w:rPr>
+          <w:sz w:val="24"/>
+          <w:szCs w:val="24"/>
+        </w:rPr>
+        <w:t>esta</w:t>
+      </w:r>
+      <w:proofErr w:type="spellEnd"/>
+      <w:r>
+        <w:rPr>
+          <w:sz w:val="24"/>
+          <w:szCs w:val="24"/>
+        </w:rPr>
+        <w:t xml:space="preserve"> compuesta por dos atributos al contrario que en las dos anteriores relaciones. Y por último vemos que el atributo </w:t>
+      </w:r>
+      <w:proofErr w:type="spellStart"/>
+      <w:r>
+        <w:rPr>
+          <w:b/>
+          <w:bCs/>
+          <w:i/>
+          <w:iCs/>
+          <w:sz w:val="24"/>
+          <w:szCs w:val="24"/>
+        </w:rPr>
+        <w:t>fecha_acceso</w:t>
+      </w:r>
+      <w:proofErr w:type="spellEnd"/>
+      <w:r>
+        <w:rPr>
+          <w:b/>
+          <w:bCs/>
+          <w:i/>
+          <w:iCs/>
+          <w:sz w:val="24"/>
+          <w:szCs w:val="24"/>
+        </w:rPr>
+        <w:t xml:space="preserve"> </w:t>
       </w:r>
       <w:r>
         <w:rPr>
@@ -3437,7 +4747,55 @@
           <w:sz w:val="24"/>
           <w:szCs w:val="24"/>
         </w:rPr>
-        <w:t xml:space="preserve">Impositor, asesor, trabaja_para, pago, cuenta_ahorro </w:t>
+        <w:t xml:space="preserve">Impositor, asesor, </w:t>
+      </w:r>
+      <w:proofErr w:type="spellStart"/>
+      <w:r>
+        <w:rPr>
+          <w:b/>
+          <w:bCs/>
+          <w:i/>
+          <w:iCs/>
+          <w:sz w:val="24"/>
+          <w:szCs w:val="24"/>
+        </w:rPr>
+        <w:t>trabaja_para</w:t>
+      </w:r>
+      <w:proofErr w:type="spellEnd"/>
+      <w:r>
+        <w:rPr>
+          <w:b/>
+          <w:bCs/>
+          <w:i/>
+          <w:iCs/>
+          <w:sz w:val="24"/>
+          <w:szCs w:val="24"/>
+        </w:rPr>
+        <w:t xml:space="preserve">, pago, </w:t>
+      </w:r>
+      <w:proofErr w:type="spellStart"/>
+      <w:r>
+        <w:rPr>
+          <w:b/>
+          <w:bCs/>
+          <w:i/>
+          <w:iCs/>
+          <w:sz w:val="24"/>
+          <w:szCs w:val="24"/>
+        </w:rPr>
+        <w:t>cuenta_ahorro</w:t>
+      </w:r>
+      <w:proofErr w:type="spellEnd"/>
+      <w:r>
+        <w:rPr>
+          <w:b/>
+          <w:bCs/>
+          <w:i/>
+          <w:iCs/>
+          <w:sz w:val="24"/>
+          <w:szCs w:val="24"/>
+        </w:rPr>
+        <w:t xml:space="preserve"> </w:t>
       </w:r>
       <w:r>
         <w:rPr>
@@ -3446,6 +4804,7 @@
         </w:rPr>
         <w:t xml:space="preserve">y </w:t>
       </w:r>
+      <w:proofErr w:type="spellStart"/>
       <w:r>
         <w:rPr>
           <w:b/>
@@ -3457,6 +4816,7 @@
         </w:rPr>
         <w:t>cuenta_corriente</w:t>
       </w:r>
+      <w:proofErr w:type="spellEnd"/>
       <w:r>
         <w:rPr>
           <w:sz w:val="24"/>
@@ -3500,7 +4860,23 @@
           <w:sz w:val="24"/>
           <w:szCs w:val="24"/>
         </w:rPr>
-        <w:t xml:space="preserve">Para este ejercicio hacemos uso del MySQL 8.0 Command Line Client. En él, ejecutamos el comando </w:t>
+        <w:t xml:space="preserve">Para este ejercicio hacemos uso del MySQL 8.0 </w:t>
+      </w:r>
+      <w:proofErr w:type="spellStart"/>
+      <w:r>
+        <w:rPr>
+          <w:sz w:val="24"/>
+          <w:szCs w:val="24"/>
+        </w:rPr>
+        <w:t>Command</w:t>
+      </w:r>
+      <w:proofErr w:type="spellEnd"/>
+      <w:r>
+        <w:rPr>
+          <w:sz w:val="24"/>
+          <w:szCs w:val="24"/>
+        </w:rPr>
+        <w:t xml:space="preserve"> Line Client. En él, ejecutamos el comando </w:t>
       </w:r>
       <w:proofErr w:type="gramStart"/>
       <w:r>
@@ -3657,7 +5033,31 @@
           <w:sz w:val="28"/>
           <w:szCs w:val="28"/>
         </w:rPr>
-        <w:t>4. Inserta una tupla en la tabla sucursal_cuenta. ¿Ha ocurrido algún error? ¿Por qué? ¿Cómo se arregla?</w:t>
+        <w:t xml:space="preserve">4. Inserta una tupla en la tabla </w:t>
+      </w:r>
+      <w:proofErr w:type="spellStart"/>
+      <w:r>
+        <w:rPr>
+          <w:b/>
+          <w:bCs/>
+          <w:i/>
+          <w:iCs/>
+          <w:sz w:val="28"/>
+          <w:szCs w:val="28"/>
+        </w:rPr>
+        <w:t>sucursal_cuenta</w:t>
+      </w:r>
+      <w:proofErr w:type="spellEnd"/>
+      <w:r>
+        <w:rPr>
+          <w:b/>
+          <w:bCs/>
+          <w:i/>
+          <w:iCs/>
+          <w:sz w:val="28"/>
+          <w:szCs w:val="28"/>
+        </w:rPr>
+        <w:t>. ¿Ha ocurrido algún error? ¿Por qué? ¿Cómo se arregla?</w:t>
       </w:r>
     </w:p>
     <w:p>
@@ -3726,23 +5126,52 @@
         </w:rPr>
         <w:t xml:space="preserve">Con el comando que se aprecia en la imagen anterior, insertamos en la tabla </w:t>
       </w:r>
-      <w:r>
-        <w:rPr>
-          <w:b/>
-          <w:bCs/>
-          <w:i/>
-          <w:iCs/>
-          <w:sz w:val="24"/>
-          <w:szCs w:val="24"/>
-        </w:rPr>
-        <w:t xml:space="preserve">sucursal_cuenta </w:t>
-      </w:r>
-      <w:r>
-        <w:rPr>
-          <w:sz w:val="24"/>
-          <w:szCs w:val="24"/>
-        </w:rPr>
-        <w:t>una tupla con los valores especificados. Al ejecutar el comando, el workbench nos notifica del siguiente error:</w:t>
+      <w:proofErr w:type="spellStart"/>
+      <w:r>
+        <w:rPr>
+          <w:b/>
+          <w:bCs/>
+          <w:i/>
+          <w:iCs/>
+          <w:sz w:val="24"/>
+          <w:szCs w:val="24"/>
+        </w:rPr>
+        <w:t>sucursal_cuenta</w:t>
+      </w:r>
+      <w:proofErr w:type="spellEnd"/>
+      <w:r>
+        <w:rPr>
+          <w:b/>
+          <w:bCs/>
+          <w:i/>
+          <w:iCs/>
+          <w:sz w:val="24"/>
+          <w:szCs w:val="24"/>
+        </w:rPr>
+        <w:t xml:space="preserve"> </w:t>
+      </w:r>
+      <w:r>
+        <w:rPr>
+          <w:sz w:val="24"/>
+          <w:szCs w:val="24"/>
+        </w:rPr>
+        <w:t xml:space="preserve">una tupla con los valores especificados. Al ejecutar el comando, el </w:t>
+      </w:r>
+      <w:proofErr w:type="spellStart"/>
+      <w:r>
+        <w:rPr>
+          <w:sz w:val="24"/>
+          <w:szCs w:val="24"/>
+        </w:rPr>
+        <w:t>workbench</w:t>
+      </w:r>
+      <w:proofErr w:type="spellEnd"/>
+      <w:r>
+        <w:rPr>
+          <w:sz w:val="24"/>
+          <w:szCs w:val="24"/>
+        </w:rPr>
+        <w:t xml:space="preserve"> nos notifica del siguiente error:</w:t>
       </w:r>
     </w:p>
     <w:p>
@@ -3827,6 +5256,7 @@
         </w:rPr>
         <w:t xml:space="preserve">por lo que las claves foráneas de la tabla </w:t>
       </w:r>
+      <w:proofErr w:type="spellStart"/>
       <w:r>
         <w:rPr>
           <w:b/>
@@ -3838,6 +5268,7 @@
         </w:rPr>
         <w:t>sucursal_cuenta</w:t>
       </w:r>
+      <w:proofErr w:type="spellEnd"/>
       <w:r>
         <w:rPr>
           <w:sz w:val="24"/>
@@ -4185,22 +5616,62 @@
           <w:sz w:val="28"/>
           <w:szCs w:val="28"/>
         </w:rPr>
-        <w:t>6. Muestra el diagrama entidad- relación de esta base de datos. Esto se realiza con el workbench. ¿Es el mismo o parecido al que hemos visto en clase?</w:t>
-      </w:r>
-    </w:p>
-    <w:p>
-      <w:pPr>
-        <w:rPr>
-          <w:sz w:val="24"/>
-          <w:szCs w:val="24"/>
-        </w:rPr>
-      </w:pPr>
-      <w:r>
-        <w:rPr>
-          <w:sz w:val="24"/>
-          <w:szCs w:val="24"/>
-        </w:rPr>
-        <w:t xml:space="preserve">Para obtener el diagrama entidad-relación de la base de datos banco, nos vamos al menú superior “Database” y seleccionamos la opción de “Reverse Engineer” </w:t>
+        <w:t xml:space="preserve">6. Muestra el diagrama entidad- relación de esta base de datos. Esto se realiza con el </w:t>
+      </w:r>
+      <w:proofErr w:type="spellStart"/>
+      <w:r>
+        <w:rPr>
+          <w:b/>
+          <w:bCs/>
+          <w:i/>
+          <w:iCs/>
+          <w:sz w:val="28"/>
+          <w:szCs w:val="28"/>
+        </w:rPr>
+        <w:t>workbench</w:t>
+      </w:r>
+      <w:proofErr w:type="spellEnd"/>
+      <w:r>
+        <w:rPr>
+          <w:b/>
+          <w:bCs/>
+          <w:i/>
+          <w:iCs/>
+          <w:sz w:val="28"/>
+          <w:szCs w:val="28"/>
+        </w:rPr>
+        <w:t>. ¿Es el mismo o parecido al que hemos visto en clase?</w:t>
+      </w:r>
+    </w:p>
+    <w:p>
+      <w:pPr>
+        <w:rPr>
+          <w:sz w:val="24"/>
+          <w:szCs w:val="24"/>
+        </w:rPr>
+      </w:pPr>
+      <w:r>
+        <w:rPr>
+          <w:sz w:val="24"/>
+          <w:szCs w:val="24"/>
+        </w:rPr>
+        <w:t>Para obtener el diagrama entidad-relación de la base de datos banco, nos vamos al menú superior “</w:t>
+      </w:r>
+      <w:proofErr w:type="spellStart"/>
+      <w:r>
+        <w:rPr>
+          <w:sz w:val="24"/>
+          <w:szCs w:val="24"/>
+        </w:rPr>
+        <w:t>Database</w:t>
+      </w:r>
+      <w:proofErr w:type="spellEnd"/>
+      <w:r>
+        <w:rPr>
+          <w:sz w:val="24"/>
+          <w:szCs w:val="24"/>
+        </w:rPr>
+        <w:t xml:space="preserve">” y seleccionamos la opción de “Reverse Engineer” </w:t>
       </w:r>
     </w:p>
     <w:p>
@@ -4268,7 +5739,23 @@
           <w:szCs w:val="24"/>
         </w:rPr>
         <w:lastRenderedPageBreak/>
-        <w:t>Si nos fijamos en el resultado del diagrama en la siguiente imagen, podemos apreciar que el modelo generado por el workbench basado en la base de datos que hemos implementado coincide con el diagrama estudiado en clase.</w:t>
+        <w:t xml:space="preserve">Si nos fijamos en el resultado del diagrama en la siguiente imagen, podemos apreciar que el modelo generado por el </w:t>
+      </w:r>
+      <w:proofErr w:type="spellStart"/>
+      <w:r>
+        <w:rPr>
+          <w:sz w:val="24"/>
+          <w:szCs w:val="24"/>
+        </w:rPr>
+        <w:t>workbench</w:t>
+      </w:r>
+      <w:proofErr w:type="spellEnd"/>
+      <w:r>
+        <w:rPr>
+          <w:sz w:val="24"/>
+          <w:szCs w:val="24"/>
+        </w:rPr>
+        <w:t xml:space="preserve"> basado en la base de datos que hemos implementado coincide con el diagrama estudiado en clase.</w:t>
       </w:r>
     </w:p>
     <w:p>
@@ -4879,7 +6366,6 @@
   <w:style w:type="character" w:default="1" w:styleId="DefaultParagraphFont">
     <w:name w:val="Default Paragraph Font"/>
     <w:uiPriority w:val="1"/>
-    <w:semiHidden/>
     <w:unhideWhenUsed/>
   </w:style>
   <w:style w:type="table" w:default="1" w:styleId="TableNormal">
@@ -4913,6 +6399,19 @@
       <w:ind w:left="720"/>
       <w:contextualSpacing/>
     </w:pPr>
+  </w:style>
+  <w:style w:type="paragraph" w:styleId="NormalWeb">
+    <w:name w:val="Normal (Web)"/>
+    <w:basedOn w:val="Normal"/>
+    <w:uiPriority w:val="99"/>
+    <w:semiHidden/>
+    <w:unhideWhenUsed/>
+    <w:rsid w:val="00687C50"/>
+    <w:rPr>
+      <w:rFonts w:ascii="Times New Roman" w:hAnsi="Times New Roman" w:cs="Times New Roman"/>
+      <w:sz w:val="24"/>
+      <w:szCs w:val="24"/>
+    </w:rPr>
   </w:style>
 </w:styles>
 </file>

</xml_diff>